<commit_message>
Update code usage table with new codelist
</commit_message>
<xml_diff>
--- a/output/tables/descriptive_tables.docx
+++ b/output/tables/descriptive_tables.docx
@@ -175,7 +175,7 @@
           <w:p>
             <w:pPr>
               <w:pStyle w:val="Normal"/>
-              <w:jc w:val="right"/>
+              <w:jc w:val="left"/>
               <w:pBdr>
                 <w:bottom w:val="none" w:sz="0" w:space="0" w:color="000000"/>
                 <w:top w:val="none" w:sz="0" w:space="0" w:color="000000"/>
@@ -230,7 +230,7 @@
           <w:p>
             <w:pPr>
               <w:pStyle w:val="Normal"/>
-              <w:jc w:val="right"/>
+              <w:jc w:val="left"/>
               <w:pBdr>
                 <w:bottom w:val="none" w:sz="0" w:space="0" w:color="000000"/>
                 <w:top w:val="none" w:sz="0" w:space="0" w:color="000000"/>
@@ -461,7 +461,7 @@
           <w:p>
             <w:pPr>
               <w:pStyle w:val="Normal"/>
-              <w:jc w:val="right"/>
+              <w:jc w:val="left"/>
               <w:pBdr>
                 <w:bottom w:val="none" w:sz="0" w:space="0" w:color="000000"/>
                 <w:top w:val="none" w:sz="0" w:space="0" w:color="000000"/>
@@ -516,38 +516,38 @@
           <w:p>
             <w:pPr>
               <w:pStyle w:val="Normal"/>
-              <w:jc w:val="right"/>
-              <w:pBdr>
-                <w:bottom w:val="none" w:sz="0" w:space="0" w:color="000000"/>
-                <w:top w:val="none" w:sz="0" w:space="0" w:color="000000"/>
-                <w:left w:val="none" w:sz="0" w:space="0" w:color="000000"/>
-                <w:right w:val="none" w:sz="0" w:space="0" w:color="000000"/>
-              </w:pBdr>
-              <w:spacing w:after="100" w:before="100" w:line="240"/>
-              <w:ind w:left="100" w:right="100" w:firstLine="0" w:firstLineChars="0"/>
-              <w:rPr>
-                <w:rFonts w:ascii="Times New Roman" w:hAnsi="Arial" w:eastAsia="Arial" w:cs="Arial"/>
-                <w:i w:val="false"/>
-                <w:b w:val="false"/>
-                <w:u w:val="none"/>
-                <w:strike w:val="false"/>
-                <w:sz w:val="24"/>
-                <w:szCs w:val="24"/>
-                <w:color w:val="000000"/>
-              </w:rPr>
-            </w:pPr>
-            <w:r>
-              <w:rPr>
-                <w:rFonts w:ascii="Times New Roman" w:hAnsi="Arial" w:eastAsia="Arial" w:cs="Arial"/>
-                <w:i w:val="false"/>
-                <w:b w:val="false"/>
-                <w:u w:val="none"/>
-                <w:strike w:val="false"/>
-                <w:sz w:val="24"/>
-                <w:szCs w:val="24"/>
-                <w:color w:val="000000"/>
-              </w:rPr>
-              <w:t xml:space="preserve">258.61</w:t>
+              <w:jc w:val="left"/>
+              <w:pBdr>
+                <w:bottom w:val="none" w:sz="0" w:space="0" w:color="000000"/>
+                <w:top w:val="none" w:sz="0" w:space="0" w:color="000000"/>
+                <w:left w:val="none" w:sz="0" w:space="0" w:color="000000"/>
+                <w:right w:val="none" w:sz="0" w:space="0" w:color="000000"/>
+              </w:pBdr>
+              <w:spacing w:after="100" w:before="100" w:line="240"/>
+              <w:ind w:left="100" w:right="100" w:firstLine="0" w:firstLineChars="0"/>
+              <w:rPr>
+                <w:rFonts w:ascii="Times New Roman" w:hAnsi="Arial" w:eastAsia="Arial" w:cs="Arial"/>
+                <w:i w:val="false"/>
+                <w:b w:val="false"/>
+                <w:u w:val="none"/>
+                <w:strike w:val="false"/>
+                <w:sz w:val="24"/>
+                <w:szCs w:val="24"/>
+                <w:color w:val="000000"/>
+              </w:rPr>
+            </w:pPr>
+            <w:r>
+              <w:rPr>
+                <w:rFonts w:ascii="Times New Roman" w:hAnsi="Arial" w:eastAsia="Arial" w:cs="Arial"/>
+                <w:i w:val="false"/>
+                <w:b w:val="false"/>
+                <w:u w:val="none"/>
+                <w:strike w:val="false"/>
+                <w:sz w:val="24"/>
+                <w:szCs w:val="24"/>
+                <w:color w:val="000000"/>
+              </w:rPr>
+              <w:t xml:space="preserve">258.61%</w:t>
             </w:r>
           </w:p>
         </w:tc>
@@ -686,38 +686,38 @@
           <w:p>
             <w:pPr>
               <w:pStyle w:val="Normal"/>
-              <w:jc w:val="right"/>
-              <w:pBdr>
-                <w:bottom w:val="none" w:sz="0" w:space="0" w:color="000000"/>
-                <w:top w:val="none" w:sz="0" w:space="0" w:color="000000"/>
-                <w:left w:val="none" w:sz="0" w:space="0" w:color="000000"/>
-                <w:right w:val="none" w:sz="0" w:space="0" w:color="000000"/>
-              </w:pBdr>
-              <w:spacing w:after="100" w:before="100" w:line="240"/>
-              <w:ind w:left="100" w:right="100" w:firstLine="0" w:firstLineChars="0"/>
-              <w:rPr>
-                <w:rFonts w:ascii="Times New Roman" w:hAnsi="Arial" w:eastAsia="Arial" w:cs="Arial"/>
-                <w:i w:val="false"/>
-                <w:b w:val="false"/>
-                <w:u w:val="none"/>
-                <w:strike w:val="false"/>
-                <w:sz w:val="24"/>
-                <w:szCs w:val="24"/>
-                <w:color w:val="000000"/>
-              </w:rPr>
-            </w:pPr>
-            <w:r>
-              <w:rPr>
-                <w:rFonts w:ascii="Times New Roman" w:hAnsi="Arial" w:eastAsia="Arial" w:cs="Arial"/>
-                <w:i w:val="false"/>
-                <w:b w:val="false"/>
-                <w:u w:val="none"/>
-                <w:strike w:val="false"/>
-                <w:sz w:val="24"/>
-                <w:szCs w:val="24"/>
-                <w:color w:val="000000"/>
-              </w:rPr>
-              <w:t xml:space="preserve">100.00</w:t>
+              <w:jc w:val="left"/>
+              <w:pBdr>
+                <w:bottom w:val="none" w:sz="0" w:space="0" w:color="000000"/>
+                <w:top w:val="none" w:sz="0" w:space="0" w:color="000000"/>
+                <w:left w:val="none" w:sz="0" w:space="0" w:color="000000"/>
+                <w:right w:val="none" w:sz="0" w:space="0" w:color="000000"/>
+              </w:pBdr>
+              <w:spacing w:after="100" w:before="100" w:line="240"/>
+              <w:ind w:left="100" w:right="100" w:firstLine="0" w:firstLineChars="0"/>
+              <w:rPr>
+                <w:rFonts w:ascii="Times New Roman" w:hAnsi="Arial" w:eastAsia="Arial" w:cs="Arial"/>
+                <w:i w:val="false"/>
+                <w:b w:val="false"/>
+                <w:u w:val="none"/>
+                <w:strike w:val="false"/>
+                <w:sz w:val="24"/>
+                <w:szCs w:val="24"/>
+                <w:color w:val="000000"/>
+              </w:rPr>
+            </w:pPr>
+            <w:r>
+              <w:rPr>
+                <w:rFonts w:ascii="Times New Roman" w:hAnsi="Arial" w:eastAsia="Arial" w:cs="Arial"/>
+                <w:i w:val="false"/>
+                <w:b w:val="false"/>
+                <w:u w:val="none"/>
+                <w:strike w:val="false"/>
+                <w:sz w:val="24"/>
+                <w:szCs w:val="24"/>
+                <w:color w:val="000000"/>
+              </w:rPr>
+              <w:t xml:space="preserve">100%</w:t>
             </w:r>
           </w:p>
         </w:tc>
@@ -741,38 +741,38 @@
           <w:p>
             <w:pPr>
               <w:pStyle w:val="Normal"/>
-              <w:jc w:val="right"/>
-              <w:pBdr>
-                <w:bottom w:val="none" w:sz="0" w:space="0" w:color="000000"/>
-                <w:top w:val="none" w:sz="0" w:space="0" w:color="000000"/>
-                <w:left w:val="none" w:sz="0" w:space="0" w:color="000000"/>
-                <w:right w:val="none" w:sz="0" w:space="0" w:color="000000"/>
-              </w:pBdr>
-              <w:spacing w:after="100" w:before="100" w:line="240"/>
-              <w:ind w:left="100" w:right="100" w:firstLine="0" w:firstLineChars="0"/>
-              <w:rPr>
-                <w:rFonts w:ascii="Times New Roman" w:hAnsi="Arial" w:eastAsia="Arial" w:cs="Arial"/>
-                <w:i w:val="false"/>
-                <w:b w:val="false"/>
-                <w:u w:val="none"/>
-                <w:strike w:val="false"/>
-                <w:sz w:val="24"/>
-                <w:szCs w:val="24"/>
-                <w:color w:val="000000"/>
-              </w:rPr>
-            </w:pPr>
-            <w:r>
-              <w:rPr>
-                <w:rFonts w:ascii="Times New Roman" w:hAnsi="Arial" w:eastAsia="Arial" w:cs="Arial"/>
-                <w:i w:val="false"/>
-                <w:b w:val="false"/>
-                <w:u w:val="none"/>
-                <w:strike w:val="false"/>
-                <w:sz w:val="24"/>
-                <w:szCs w:val="24"/>
-                <w:color w:val="000000"/>
-              </w:rPr>
-              <w:t xml:space="preserve">604.73</w:t>
+              <w:jc w:val="left"/>
+              <w:pBdr>
+                <w:bottom w:val="none" w:sz="0" w:space="0" w:color="000000"/>
+                <w:top w:val="none" w:sz="0" w:space="0" w:color="000000"/>
+                <w:left w:val="none" w:sz="0" w:space="0" w:color="000000"/>
+                <w:right w:val="none" w:sz="0" w:space="0" w:color="000000"/>
+              </w:pBdr>
+              <w:spacing w:after="100" w:before="100" w:line="240"/>
+              <w:ind w:left="100" w:right="100" w:firstLine="0" w:firstLineChars="0"/>
+              <w:rPr>
+                <w:rFonts w:ascii="Times New Roman" w:hAnsi="Arial" w:eastAsia="Arial" w:cs="Arial"/>
+                <w:i w:val="false"/>
+                <w:b w:val="false"/>
+                <w:u w:val="none"/>
+                <w:strike w:val="false"/>
+                <w:sz w:val="24"/>
+                <w:szCs w:val="24"/>
+                <w:color w:val="000000"/>
+              </w:rPr>
+            </w:pPr>
+            <w:r>
+              <w:rPr>
+                <w:rFonts w:ascii="Times New Roman" w:hAnsi="Arial" w:eastAsia="Arial" w:cs="Arial"/>
+                <w:i w:val="false"/>
+                <w:b w:val="false"/>
+                <w:u w:val="none"/>
+                <w:strike w:val="false"/>
+                <w:sz w:val="24"/>
+                <w:szCs w:val="24"/>
+                <w:color w:val="000000"/>
+              </w:rPr>
+              <w:t xml:space="preserve">604.73%</w:t>
             </w:r>
           </w:p>
         </w:tc>
@@ -911,38 +911,38 @@
           <w:p>
             <w:pPr>
               <w:pStyle w:val="Normal"/>
-              <w:jc w:val="right"/>
-              <w:pBdr>
-                <w:bottom w:val="none" w:sz="0" w:space="0" w:color="000000"/>
-                <w:top w:val="none" w:sz="0" w:space="0" w:color="000000"/>
-                <w:left w:val="none" w:sz="0" w:space="0" w:color="000000"/>
-                <w:right w:val="none" w:sz="0" w:space="0" w:color="000000"/>
-              </w:pBdr>
-              <w:spacing w:after="100" w:before="100" w:line="240"/>
-              <w:ind w:left="100" w:right="100" w:firstLine="0" w:firstLineChars="0"/>
-              <w:rPr>
-                <w:rFonts w:ascii="Times New Roman" w:hAnsi="Arial" w:eastAsia="Arial" w:cs="Arial"/>
-                <w:i w:val="false"/>
-                <w:b w:val="false"/>
-                <w:u w:val="none"/>
-                <w:strike w:val="false"/>
-                <w:sz w:val="24"/>
-                <w:szCs w:val="24"/>
-                <w:color w:val="000000"/>
-              </w:rPr>
-            </w:pPr>
-            <w:r>
-              <w:rPr>
-                <w:rFonts w:ascii="Times New Roman" w:hAnsi="Arial" w:eastAsia="Arial" w:cs="Arial"/>
-                <w:i w:val="false"/>
-                <w:b w:val="false"/>
-                <w:u w:val="none"/>
-                <w:strike w:val="false"/>
-                <w:sz w:val="24"/>
-                <w:szCs w:val="24"/>
-                <w:color w:val="000000"/>
-              </w:rPr>
-              <w:t xml:space="preserve">92.28</w:t>
+              <w:jc w:val="left"/>
+              <w:pBdr>
+                <w:bottom w:val="none" w:sz="0" w:space="0" w:color="000000"/>
+                <w:top w:val="none" w:sz="0" w:space="0" w:color="000000"/>
+                <w:left w:val="none" w:sz="0" w:space="0" w:color="000000"/>
+                <w:right w:val="none" w:sz="0" w:space="0" w:color="000000"/>
+              </w:pBdr>
+              <w:spacing w:after="100" w:before="100" w:line="240"/>
+              <w:ind w:left="100" w:right="100" w:firstLine="0" w:firstLineChars="0"/>
+              <w:rPr>
+                <w:rFonts w:ascii="Times New Roman" w:hAnsi="Arial" w:eastAsia="Arial" w:cs="Arial"/>
+                <w:i w:val="false"/>
+                <w:b w:val="false"/>
+                <w:u w:val="none"/>
+                <w:strike w:val="false"/>
+                <w:sz w:val="24"/>
+                <w:szCs w:val="24"/>
+                <w:color w:val="000000"/>
+              </w:rPr>
+            </w:pPr>
+            <w:r>
+              <w:rPr>
+                <w:rFonts w:ascii="Times New Roman" w:hAnsi="Arial" w:eastAsia="Arial" w:cs="Arial"/>
+                <w:i w:val="false"/>
+                <w:b w:val="false"/>
+                <w:u w:val="none"/>
+                <w:strike w:val="false"/>
+                <w:sz w:val="24"/>
+                <w:szCs w:val="24"/>
+                <w:color w:val="000000"/>
+              </w:rPr>
+              <w:t xml:space="preserve">92.28%</w:t>
             </w:r>
           </w:p>
         </w:tc>
@@ -966,38 +966,38 @@
           <w:p>
             <w:pPr>
               <w:pStyle w:val="Normal"/>
-              <w:jc w:val="right"/>
-              <w:pBdr>
-                <w:bottom w:val="none" w:sz="0" w:space="0" w:color="000000"/>
-                <w:top w:val="none" w:sz="0" w:space="0" w:color="000000"/>
-                <w:left w:val="none" w:sz="0" w:space="0" w:color="000000"/>
-                <w:right w:val="none" w:sz="0" w:space="0" w:color="000000"/>
-              </w:pBdr>
-              <w:spacing w:after="100" w:before="100" w:line="240"/>
-              <w:ind w:left="100" w:right="100" w:firstLine="0" w:firstLineChars="0"/>
-              <w:rPr>
-                <w:rFonts w:ascii="Times New Roman" w:hAnsi="Arial" w:eastAsia="Arial" w:cs="Arial"/>
-                <w:i w:val="false"/>
-                <w:b w:val="false"/>
-                <w:u w:val="none"/>
-                <w:strike w:val="false"/>
-                <w:sz w:val="24"/>
-                <w:szCs w:val="24"/>
-                <w:color w:val="000000"/>
-              </w:rPr>
-            </w:pPr>
-            <w:r>
-              <w:rPr>
-                <w:rFonts w:ascii="Times New Roman" w:hAnsi="Arial" w:eastAsia="Arial" w:cs="Arial"/>
-                <w:i w:val="false"/>
-                <w:b w:val="false"/>
-                <w:u w:val="none"/>
-                <w:strike w:val="false"/>
-                <w:sz w:val="24"/>
-                <w:szCs w:val="24"/>
-                <w:color w:val="000000"/>
-              </w:rPr>
-              <w:t xml:space="preserve">594.87</w:t>
+              <w:jc w:val="left"/>
+              <w:pBdr>
+                <w:bottom w:val="none" w:sz="0" w:space="0" w:color="000000"/>
+                <w:top w:val="none" w:sz="0" w:space="0" w:color="000000"/>
+                <w:left w:val="none" w:sz="0" w:space="0" w:color="000000"/>
+                <w:right w:val="none" w:sz="0" w:space="0" w:color="000000"/>
+              </w:pBdr>
+              <w:spacing w:after="100" w:before="100" w:line="240"/>
+              <w:ind w:left="100" w:right="100" w:firstLine="0" w:firstLineChars="0"/>
+              <w:rPr>
+                <w:rFonts w:ascii="Times New Roman" w:hAnsi="Arial" w:eastAsia="Arial" w:cs="Arial"/>
+                <w:i w:val="false"/>
+                <w:b w:val="false"/>
+                <w:u w:val="none"/>
+                <w:strike w:val="false"/>
+                <w:sz w:val="24"/>
+                <w:szCs w:val="24"/>
+                <w:color w:val="000000"/>
+              </w:rPr>
+            </w:pPr>
+            <w:r>
+              <w:rPr>
+                <w:rFonts w:ascii="Times New Roman" w:hAnsi="Arial" w:eastAsia="Arial" w:cs="Arial"/>
+                <w:i w:val="false"/>
+                <w:b w:val="false"/>
+                <w:u w:val="none"/>
+                <w:strike w:val="false"/>
+                <w:sz w:val="24"/>
+                <w:szCs w:val="24"/>
+                <w:color w:val="000000"/>
+              </w:rPr>
+              <w:t xml:space="preserve">594.87%</w:t>
             </w:r>
           </w:p>
         </w:tc>
@@ -1136,38 +1136,38 @@
           <w:p>
             <w:pPr>
               <w:pStyle w:val="Normal"/>
-              <w:jc w:val="right"/>
-              <w:pBdr>
-                <w:bottom w:val="none" w:sz="0" w:space="0" w:color="000000"/>
-                <w:top w:val="none" w:sz="0" w:space="0" w:color="000000"/>
-                <w:left w:val="none" w:sz="0" w:space="0" w:color="000000"/>
-                <w:right w:val="none" w:sz="0" w:space="0" w:color="000000"/>
-              </w:pBdr>
-              <w:spacing w:after="100" w:before="100" w:line="240"/>
-              <w:ind w:left="100" w:right="100" w:firstLine="0" w:firstLineChars="0"/>
-              <w:rPr>
-                <w:rFonts w:ascii="Times New Roman" w:hAnsi="Arial" w:eastAsia="Arial" w:cs="Arial"/>
-                <w:i w:val="false"/>
-                <w:b w:val="false"/>
-                <w:u w:val="none"/>
-                <w:strike w:val="false"/>
-                <w:sz w:val="24"/>
-                <w:szCs w:val="24"/>
-                <w:color w:val="000000"/>
-              </w:rPr>
-            </w:pPr>
-            <w:r>
-              <w:rPr>
-                <w:rFonts w:ascii="Times New Roman" w:hAnsi="Arial" w:eastAsia="Arial" w:cs="Arial"/>
-                <w:i w:val="false"/>
-                <w:b w:val="false"/>
-                <w:u w:val="none"/>
-                <w:strike w:val="false"/>
-                <w:sz w:val="24"/>
-                <w:szCs w:val="24"/>
-                <w:color w:val="000000"/>
-              </w:rPr>
-              <w:t xml:space="preserve">2.28</w:t>
+              <w:jc w:val="left"/>
+              <w:pBdr>
+                <w:bottom w:val="none" w:sz="0" w:space="0" w:color="000000"/>
+                <w:top w:val="none" w:sz="0" w:space="0" w:color="000000"/>
+                <w:left w:val="none" w:sz="0" w:space="0" w:color="000000"/>
+                <w:right w:val="none" w:sz="0" w:space="0" w:color="000000"/>
+              </w:pBdr>
+              <w:spacing w:after="100" w:before="100" w:line="240"/>
+              <w:ind w:left="100" w:right="100" w:firstLine="0" w:firstLineChars="0"/>
+              <w:rPr>
+                <w:rFonts w:ascii="Times New Roman" w:hAnsi="Arial" w:eastAsia="Arial" w:cs="Arial"/>
+                <w:i w:val="false"/>
+                <w:b w:val="false"/>
+                <w:u w:val="none"/>
+                <w:strike w:val="false"/>
+                <w:sz w:val="24"/>
+                <w:szCs w:val="24"/>
+                <w:color w:val="000000"/>
+              </w:rPr>
+            </w:pPr>
+            <w:r>
+              <w:rPr>
+                <w:rFonts w:ascii="Times New Roman" w:hAnsi="Arial" w:eastAsia="Arial" w:cs="Arial"/>
+                <w:i w:val="false"/>
+                <w:b w:val="false"/>
+                <w:u w:val="none"/>
+                <w:strike w:val="false"/>
+                <w:sz w:val="24"/>
+                <w:szCs w:val="24"/>
+                <w:color w:val="000000"/>
+              </w:rPr>
+              <w:t xml:space="preserve">2.28%</w:t>
             </w:r>
           </w:p>
         </w:tc>
@@ -1191,38 +1191,38 @@
           <w:p>
             <w:pPr>
               <w:pStyle w:val="Normal"/>
-              <w:jc w:val="right"/>
-              <w:pBdr>
-                <w:bottom w:val="none" w:sz="0" w:space="0" w:color="000000"/>
-                <w:top w:val="none" w:sz="0" w:space="0" w:color="000000"/>
-                <w:left w:val="none" w:sz="0" w:space="0" w:color="000000"/>
-                <w:right w:val="none" w:sz="0" w:space="0" w:color="000000"/>
-              </w:pBdr>
-              <w:spacing w:after="100" w:before="100" w:line="240"/>
-              <w:ind w:left="100" w:right="100" w:firstLine="0" w:firstLineChars="0"/>
-              <w:rPr>
-                <w:rFonts w:ascii="Times New Roman" w:hAnsi="Arial" w:eastAsia="Arial" w:cs="Arial"/>
-                <w:i w:val="false"/>
-                <w:b w:val="false"/>
-                <w:u w:val="none"/>
-                <w:strike w:val="false"/>
-                <w:sz w:val="24"/>
-                <w:szCs w:val="24"/>
-                <w:color w:val="000000"/>
-              </w:rPr>
-            </w:pPr>
-            <w:r>
-              <w:rPr>
-                <w:rFonts w:ascii="Times New Roman" w:hAnsi="Arial" w:eastAsia="Arial" w:cs="Arial"/>
-                <w:i w:val="false"/>
-                <w:b w:val="false"/>
-                <w:u w:val="none"/>
-                <w:strike w:val="false"/>
-                <w:sz w:val="24"/>
-                <w:szCs w:val="24"/>
-                <w:color w:val="000000"/>
-              </w:rPr>
-              <w:t xml:space="preserve">-6.36</w:t>
+              <w:jc w:val="left"/>
+              <w:pBdr>
+                <w:bottom w:val="none" w:sz="0" w:space="0" w:color="000000"/>
+                <w:top w:val="none" w:sz="0" w:space="0" w:color="000000"/>
+                <w:left w:val="none" w:sz="0" w:space="0" w:color="000000"/>
+                <w:right w:val="none" w:sz="0" w:space="0" w:color="000000"/>
+              </w:pBdr>
+              <w:spacing w:after="100" w:before="100" w:line="240"/>
+              <w:ind w:left="100" w:right="100" w:firstLine="0" w:firstLineChars="0"/>
+              <w:rPr>
+                <w:rFonts w:ascii="Times New Roman" w:hAnsi="Arial" w:eastAsia="Arial" w:cs="Arial"/>
+                <w:i w:val="false"/>
+                <w:b w:val="false"/>
+                <w:u w:val="none"/>
+                <w:strike w:val="false"/>
+                <w:sz w:val="24"/>
+                <w:szCs w:val="24"/>
+                <w:color w:val="000000"/>
+              </w:rPr>
+            </w:pPr>
+            <w:r>
+              <w:rPr>
+                <w:rFonts w:ascii="Times New Roman" w:hAnsi="Arial" w:eastAsia="Arial" w:cs="Arial"/>
+                <w:i w:val="false"/>
+                <w:b w:val="false"/>
+                <w:u w:val="none"/>
+                <w:strike w:val="false"/>
+                <w:sz w:val="24"/>
+                <w:szCs w:val="24"/>
+                <w:color w:val="000000"/>
+              </w:rPr>
+              <w:t xml:space="preserve">-6.36%</w:t>
             </w:r>
           </w:p>
         </w:tc>
@@ -1361,38 +1361,38 @@
           <w:p>
             <w:pPr>
               <w:pStyle w:val="Normal"/>
-              <w:jc w:val="right"/>
-              <w:pBdr>
-                <w:bottom w:val="none" w:sz="0" w:space="0" w:color="000000"/>
-                <w:top w:val="none" w:sz="0" w:space="0" w:color="000000"/>
-                <w:left w:val="none" w:sz="0" w:space="0" w:color="000000"/>
-                <w:right w:val="none" w:sz="0" w:space="0" w:color="000000"/>
-              </w:pBdr>
-              <w:spacing w:after="100" w:before="100" w:line="240"/>
-              <w:ind w:left="100" w:right="100" w:firstLine="0" w:firstLineChars="0"/>
-              <w:rPr>
-                <w:rFonts w:ascii="Times New Roman" w:hAnsi="Arial" w:eastAsia="Arial" w:cs="Arial"/>
-                <w:i w:val="false"/>
-                <w:b w:val="false"/>
-                <w:u w:val="none"/>
-                <w:strike w:val="false"/>
-                <w:sz w:val="24"/>
-                <w:szCs w:val="24"/>
-                <w:color w:val="000000"/>
-              </w:rPr>
-            </w:pPr>
-            <w:r>
-              <w:rPr>
-                <w:rFonts w:ascii="Times New Roman" w:hAnsi="Arial" w:eastAsia="Arial" w:cs="Arial"/>
-                <w:i w:val="false"/>
-                <w:b w:val="false"/>
-                <w:u w:val="none"/>
-                <w:strike w:val="false"/>
-                <w:sz w:val="24"/>
-                <w:szCs w:val="24"/>
-                <w:color w:val="000000"/>
-              </w:rPr>
-              <w:t xml:space="preserve">1.78</w:t>
+              <w:jc w:val="left"/>
+              <w:pBdr>
+                <w:bottom w:val="none" w:sz="0" w:space="0" w:color="000000"/>
+                <w:top w:val="none" w:sz="0" w:space="0" w:color="000000"/>
+                <w:left w:val="none" w:sz="0" w:space="0" w:color="000000"/>
+                <w:right w:val="none" w:sz="0" w:space="0" w:color="000000"/>
+              </w:pBdr>
+              <w:spacing w:after="100" w:before="100" w:line="240"/>
+              <w:ind w:left="100" w:right="100" w:firstLine="0" w:firstLineChars="0"/>
+              <w:rPr>
+                <w:rFonts w:ascii="Times New Roman" w:hAnsi="Arial" w:eastAsia="Arial" w:cs="Arial"/>
+                <w:i w:val="false"/>
+                <w:b w:val="false"/>
+                <w:u w:val="none"/>
+                <w:strike w:val="false"/>
+                <w:sz w:val="24"/>
+                <w:szCs w:val="24"/>
+                <w:color w:val="000000"/>
+              </w:rPr>
+            </w:pPr>
+            <w:r>
+              <w:rPr>
+                <w:rFonts w:ascii="Times New Roman" w:hAnsi="Arial" w:eastAsia="Arial" w:cs="Arial"/>
+                <w:i w:val="false"/>
+                <w:b w:val="false"/>
+                <w:u w:val="none"/>
+                <w:strike w:val="false"/>
+                <w:sz w:val="24"/>
+                <w:szCs w:val="24"/>
+                <w:color w:val="000000"/>
+              </w:rPr>
+              <w:t xml:space="preserve">1.78%</w:t>
             </w:r>
           </w:p>
         </w:tc>
@@ -1416,38 +1416,38 @@
           <w:p>
             <w:pPr>
               <w:pStyle w:val="Normal"/>
-              <w:jc w:val="right"/>
-              <w:pBdr>
-                <w:bottom w:val="none" w:sz="0" w:space="0" w:color="000000"/>
-                <w:top w:val="none" w:sz="0" w:space="0" w:color="000000"/>
-                <w:left w:val="none" w:sz="0" w:space="0" w:color="000000"/>
-                <w:right w:val="none" w:sz="0" w:space="0" w:color="000000"/>
-              </w:pBdr>
-              <w:spacing w:after="100" w:before="100" w:line="240"/>
-              <w:ind w:left="100" w:right="100" w:firstLine="0" w:firstLineChars="0"/>
-              <w:rPr>
-                <w:rFonts w:ascii="Times New Roman" w:hAnsi="Arial" w:eastAsia="Arial" w:cs="Arial"/>
-                <w:i w:val="false"/>
-                <w:b w:val="false"/>
-                <w:u w:val="none"/>
-                <w:strike w:val="false"/>
-                <w:sz w:val="24"/>
-                <w:szCs w:val="24"/>
-                <w:color w:val="000000"/>
-              </w:rPr>
-            </w:pPr>
-            <w:r>
-              <w:rPr>
-                <w:rFonts w:ascii="Times New Roman" w:hAnsi="Arial" w:eastAsia="Arial" w:cs="Arial"/>
-                <w:i w:val="false"/>
-                <w:b w:val="false"/>
-                <w:u w:val="none"/>
-                <w:strike w:val="false"/>
-                <w:sz w:val="24"/>
-                <w:szCs w:val="24"/>
-                <w:color w:val="000000"/>
-              </w:rPr>
-              <w:t xml:space="preserve">4,269.23</w:t>
+              <w:jc w:val="left"/>
+              <w:pBdr>
+                <w:bottom w:val="none" w:sz="0" w:space="0" w:color="000000"/>
+                <w:top w:val="none" w:sz="0" w:space="0" w:color="000000"/>
+                <w:left w:val="none" w:sz="0" w:space="0" w:color="000000"/>
+                <w:right w:val="none" w:sz="0" w:space="0" w:color="000000"/>
+              </w:pBdr>
+              <w:spacing w:after="100" w:before="100" w:line="240"/>
+              <w:ind w:left="100" w:right="100" w:firstLine="0" w:firstLineChars="0"/>
+              <w:rPr>
+                <w:rFonts w:ascii="Times New Roman" w:hAnsi="Arial" w:eastAsia="Arial" w:cs="Arial"/>
+                <w:i w:val="false"/>
+                <w:b w:val="false"/>
+                <w:u w:val="none"/>
+                <w:strike w:val="false"/>
+                <w:sz w:val="24"/>
+                <w:szCs w:val="24"/>
+                <w:color w:val="000000"/>
+              </w:rPr>
+            </w:pPr>
+            <w:r>
+              <w:rPr>
+                <w:rFonts w:ascii="Times New Roman" w:hAnsi="Arial" w:eastAsia="Arial" w:cs="Arial"/>
+                <w:i w:val="false"/>
+                <w:b w:val="false"/>
+                <w:u w:val="none"/>
+                <w:strike w:val="false"/>
+                <w:sz w:val="24"/>
+                <w:szCs w:val="24"/>
+                <w:color w:val="000000"/>
+              </w:rPr>
+              <w:t xml:space="preserve">4269.23%</w:t>
             </w:r>
           </w:p>
         </w:tc>
@@ -1586,38 +1586,38 @@
           <w:p>
             <w:pPr>
               <w:pStyle w:val="Normal"/>
-              <w:jc w:val="right"/>
-              <w:pBdr>
-                <w:bottom w:val="none" w:sz="0" w:space="0" w:color="000000"/>
-                <w:top w:val="none" w:sz="0" w:space="0" w:color="000000"/>
-                <w:left w:val="none" w:sz="0" w:space="0" w:color="000000"/>
-                <w:right w:val="none" w:sz="0" w:space="0" w:color="000000"/>
-              </w:pBdr>
-              <w:spacing w:after="100" w:before="100" w:line="240"/>
-              <w:ind w:left="100" w:right="100" w:firstLine="0" w:firstLineChars="0"/>
-              <w:rPr>
-                <w:rFonts w:ascii="Times New Roman" w:hAnsi="Arial" w:eastAsia="Arial" w:cs="Arial"/>
-                <w:i w:val="false"/>
-                <w:b w:val="false"/>
-                <w:u w:val="none"/>
-                <w:strike w:val="false"/>
-                <w:sz w:val="24"/>
-                <w:szCs w:val="24"/>
-                <w:color w:val="000000"/>
-              </w:rPr>
-            </w:pPr>
-            <w:r>
-              <w:rPr>
-                <w:rFonts w:ascii="Times New Roman" w:hAnsi="Arial" w:eastAsia="Arial" w:cs="Arial"/>
-                <w:i w:val="false"/>
-                <w:b w:val="false"/>
-                <w:u w:val="none"/>
-                <w:strike w:val="false"/>
-                <w:sz w:val="24"/>
-                <w:szCs w:val="24"/>
-                <w:color w:val="000000"/>
-              </w:rPr>
-              <w:t xml:space="preserve">1.58</w:t>
+              <w:jc w:val="left"/>
+              <w:pBdr>
+                <w:bottom w:val="none" w:sz="0" w:space="0" w:color="000000"/>
+                <w:top w:val="none" w:sz="0" w:space="0" w:color="000000"/>
+                <w:left w:val="none" w:sz="0" w:space="0" w:color="000000"/>
+                <w:right w:val="none" w:sz="0" w:space="0" w:color="000000"/>
+              </w:pBdr>
+              <w:spacing w:after="100" w:before="100" w:line="240"/>
+              <w:ind w:left="100" w:right="100" w:firstLine="0" w:firstLineChars="0"/>
+              <w:rPr>
+                <w:rFonts w:ascii="Times New Roman" w:hAnsi="Arial" w:eastAsia="Arial" w:cs="Arial"/>
+                <w:i w:val="false"/>
+                <w:b w:val="false"/>
+                <w:u w:val="none"/>
+                <w:strike w:val="false"/>
+                <w:sz w:val="24"/>
+                <w:szCs w:val="24"/>
+                <w:color w:val="000000"/>
+              </w:rPr>
+            </w:pPr>
+            <w:r>
+              <w:rPr>
+                <w:rFonts w:ascii="Times New Roman" w:hAnsi="Arial" w:eastAsia="Arial" w:cs="Arial"/>
+                <w:i w:val="false"/>
+                <w:b w:val="false"/>
+                <w:u w:val="none"/>
+                <w:strike w:val="false"/>
+                <w:sz w:val="24"/>
+                <w:szCs w:val="24"/>
+                <w:color w:val="000000"/>
+              </w:rPr>
+              <w:t xml:space="preserve">1.58%</w:t>
             </w:r>
           </w:p>
         </w:tc>
@@ -1641,38 +1641,38 @@
           <w:p>
             <w:pPr>
               <w:pStyle w:val="Normal"/>
-              <w:jc w:val="right"/>
-              <w:pBdr>
-                <w:bottom w:val="none" w:sz="0" w:space="0" w:color="000000"/>
-                <w:top w:val="none" w:sz="0" w:space="0" w:color="000000"/>
-                <w:left w:val="none" w:sz="0" w:space="0" w:color="000000"/>
-                <w:right w:val="none" w:sz="0" w:space="0" w:color="000000"/>
-              </w:pBdr>
-              <w:spacing w:after="100" w:before="100" w:line="240"/>
-              <w:ind w:left="100" w:right="100" w:firstLine="0" w:firstLineChars="0"/>
-              <w:rPr>
-                <w:rFonts w:ascii="Times New Roman" w:hAnsi="Arial" w:eastAsia="Arial" w:cs="Arial"/>
-                <w:i w:val="false"/>
-                <w:b w:val="false"/>
-                <w:u w:val="none"/>
-                <w:strike w:val="false"/>
-                <w:sz w:val="24"/>
-                <w:szCs w:val="24"/>
-                <w:color w:val="000000"/>
-              </w:rPr>
-            </w:pPr>
-            <w:r>
-              <w:rPr>
-                <w:rFonts w:ascii="Times New Roman" w:hAnsi="Arial" w:eastAsia="Arial" w:cs="Arial"/>
-                <w:i w:val="false"/>
-                <w:b w:val="false"/>
-                <w:u w:val="none"/>
-                <w:strike w:val="false"/>
-                <w:sz w:val="24"/>
-                <w:szCs w:val="24"/>
-                <w:color w:val="000000"/>
-              </w:rPr>
-              <w:t xml:space="preserve">305,700.00</w:t>
+              <w:jc w:val="left"/>
+              <w:pBdr>
+                <w:bottom w:val="none" w:sz="0" w:space="0" w:color="000000"/>
+                <w:top w:val="none" w:sz="0" w:space="0" w:color="000000"/>
+                <w:left w:val="none" w:sz="0" w:space="0" w:color="000000"/>
+                <w:right w:val="none" w:sz="0" w:space="0" w:color="000000"/>
+              </w:pBdr>
+              <w:spacing w:after="100" w:before="100" w:line="240"/>
+              <w:ind w:left="100" w:right="100" w:firstLine="0" w:firstLineChars="0"/>
+              <w:rPr>
+                <w:rFonts w:ascii="Times New Roman" w:hAnsi="Arial" w:eastAsia="Arial" w:cs="Arial"/>
+                <w:i w:val="false"/>
+                <w:b w:val="false"/>
+                <w:u w:val="none"/>
+                <w:strike w:val="false"/>
+                <w:sz w:val="24"/>
+                <w:szCs w:val="24"/>
+                <w:color w:val="000000"/>
+              </w:rPr>
+            </w:pPr>
+            <w:r>
+              <w:rPr>
+                <w:rFonts w:ascii="Times New Roman" w:hAnsi="Arial" w:eastAsia="Arial" w:cs="Arial"/>
+                <w:i w:val="false"/>
+                <w:b w:val="false"/>
+                <w:u w:val="none"/>
+                <w:strike w:val="false"/>
+                <w:sz w:val="24"/>
+                <w:szCs w:val="24"/>
+                <w:color w:val="000000"/>
+              </w:rPr>
+              <w:t xml:space="preserve">305700%</w:t>
             </w:r>
           </w:p>
         </w:tc>
@@ -1825,38 +1825,38 @@
           <w:p>
             <w:pPr>
               <w:pStyle w:val="Normal"/>
-              <w:jc w:val="right"/>
-              <w:pBdr>
-                <w:bottom w:val="none" w:sz="0" w:space="0" w:color="000000"/>
-                <w:top w:val="none" w:sz="0" w:space="0" w:color="000000"/>
-                <w:left w:val="none" w:sz="0" w:space="0" w:color="000000"/>
-                <w:right w:val="none" w:sz="0" w:space="0" w:color="000000"/>
-              </w:pBdr>
-              <w:spacing w:after="100" w:before="100" w:line="240"/>
-              <w:ind w:left="100" w:right="100" w:firstLine="0" w:firstLineChars="0"/>
-              <w:rPr>
-                <w:rFonts w:ascii="Times New Roman" w:hAnsi="Arial" w:eastAsia="Arial" w:cs="Arial"/>
-                <w:i w:val="false"/>
-                <w:b w:val="false"/>
-                <w:u w:val="none"/>
-                <w:strike w:val="false"/>
-                <w:sz w:val="24"/>
-                <w:szCs w:val="24"/>
-                <w:color w:val="000000"/>
-              </w:rPr>
-            </w:pPr>
-            <w:r>
-              <w:rPr>
-                <w:rFonts w:ascii="Times New Roman" w:hAnsi="Arial" w:eastAsia="Arial" w:cs="Arial"/>
-                <w:i w:val="false"/>
-                <w:b w:val="false"/>
-                <w:u w:val="none"/>
-                <w:strike w:val="false"/>
-                <w:sz w:val="24"/>
-                <w:szCs w:val="24"/>
-                <w:color w:val="000000"/>
-              </w:rPr>
-              <w:t xml:space="preserve">0.83</w:t>
+              <w:jc w:val="left"/>
+              <w:pBdr>
+                <w:bottom w:val="none" w:sz="0" w:space="0" w:color="000000"/>
+                <w:top w:val="none" w:sz="0" w:space="0" w:color="000000"/>
+                <w:left w:val="none" w:sz="0" w:space="0" w:color="000000"/>
+                <w:right w:val="none" w:sz="0" w:space="0" w:color="000000"/>
+              </w:pBdr>
+              <w:spacing w:after="100" w:before="100" w:line="240"/>
+              <w:ind w:left="100" w:right="100" w:firstLine="0" w:firstLineChars="0"/>
+              <w:rPr>
+                <w:rFonts w:ascii="Times New Roman" w:hAnsi="Arial" w:eastAsia="Arial" w:cs="Arial"/>
+                <w:i w:val="false"/>
+                <w:b w:val="false"/>
+                <w:u w:val="none"/>
+                <w:strike w:val="false"/>
+                <w:sz w:val="24"/>
+                <w:szCs w:val="24"/>
+                <w:color w:val="000000"/>
+              </w:rPr>
+            </w:pPr>
+            <w:r>
+              <w:rPr>
+                <w:rFonts w:ascii="Times New Roman" w:hAnsi="Arial" w:eastAsia="Arial" w:cs="Arial"/>
+                <w:i w:val="false"/>
+                <w:b w:val="false"/>
+                <w:u w:val="none"/>
+                <w:strike w:val="false"/>
+                <w:sz w:val="24"/>
+                <w:szCs w:val="24"/>
+                <w:color w:val="000000"/>
+              </w:rPr>
+              <w:t xml:space="preserve">0.83%</w:t>
             </w:r>
           </w:p>
         </w:tc>
@@ -1880,38 +1880,38 @@
           <w:p>
             <w:pPr>
               <w:pStyle w:val="Normal"/>
-              <w:jc w:val="right"/>
-              <w:pBdr>
-                <w:bottom w:val="none" w:sz="0" w:space="0" w:color="000000"/>
-                <w:top w:val="none" w:sz="0" w:space="0" w:color="000000"/>
-                <w:left w:val="none" w:sz="0" w:space="0" w:color="000000"/>
-                <w:right w:val="none" w:sz="0" w:space="0" w:color="000000"/>
-              </w:pBdr>
-              <w:spacing w:after="100" w:before="100" w:line="240"/>
-              <w:ind w:left="100" w:right="100" w:firstLine="0" w:firstLineChars="0"/>
-              <w:rPr>
-                <w:rFonts w:ascii="Times New Roman" w:hAnsi="Arial" w:eastAsia="Arial" w:cs="Arial"/>
-                <w:i w:val="false"/>
-                <w:b w:val="false"/>
-                <w:u w:val="none"/>
-                <w:strike w:val="false"/>
-                <w:sz w:val="24"/>
-                <w:szCs w:val="24"/>
-                <w:color w:val="000000"/>
-              </w:rPr>
-            </w:pPr>
-            <w:r>
-              <w:rPr>
-                <w:rFonts w:ascii="Times New Roman" w:hAnsi="Arial" w:eastAsia="Arial" w:cs="Arial"/>
-                <w:i w:val="false"/>
-                <w:b w:val="false"/>
-                <w:u w:val="none"/>
-                <w:strike w:val="false"/>
-                <w:sz w:val="24"/>
-                <w:szCs w:val="24"/>
-                <w:color w:val="000000"/>
-              </w:rPr>
-              <w:t xml:space="preserve">14,220.00</w:t>
+              <w:jc w:val="left"/>
+              <w:pBdr>
+                <w:bottom w:val="none" w:sz="0" w:space="0" w:color="000000"/>
+                <w:top w:val="none" w:sz="0" w:space="0" w:color="000000"/>
+                <w:left w:val="none" w:sz="0" w:space="0" w:color="000000"/>
+                <w:right w:val="none" w:sz="0" w:space="0" w:color="000000"/>
+              </w:pBdr>
+              <w:spacing w:after="100" w:before="100" w:line="240"/>
+              <w:ind w:left="100" w:right="100" w:firstLine="0" w:firstLineChars="0"/>
+              <w:rPr>
+                <w:rFonts w:ascii="Times New Roman" w:hAnsi="Arial" w:eastAsia="Arial" w:cs="Arial"/>
+                <w:i w:val="false"/>
+                <w:b w:val="false"/>
+                <w:u w:val="none"/>
+                <w:strike w:val="false"/>
+                <w:sz w:val="24"/>
+                <w:szCs w:val="24"/>
+                <w:color w:val="000000"/>
+              </w:rPr>
+            </w:pPr>
+            <w:r>
+              <w:rPr>
+                <w:rFonts w:ascii="Times New Roman" w:hAnsi="Arial" w:eastAsia="Arial" w:cs="Arial"/>
+                <w:i w:val="false"/>
+                <w:b w:val="false"/>
+                <w:u w:val="none"/>
+                <w:strike w:val="false"/>
+                <w:sz w:val="24"/>
+                <w:szCs w:val="24"/>
+                <w:color w:val="000000"/>
+              </w:rPr>
+              <w:t xml:space="preserve">14220%</w:t>
             </w:r>
           </w:p>
         </w:tc>
@@ -2111,7 +2111,7 @@
           <w:p>
             <w:pPr>
               <w:pStyle w:val="Normal"/>
-              <w:jc w:val="right"/>
+              <w:jc w:val="left"/>
               <w:pBdr>
                 <w:bottom w:val="none" w:sz="0" w:space="0" w:color="000000"/>
                 <w:top w:val="none" w:sz="0" w:space="0" w:color="000000"/>
@@ -2166,38 +2166,38 @@
           <w:p>
             <w:pPr>
               <w:pStyle w:val="Normal"/>
-              <w:jc w:val="right"/>
-              <w:pBdr>
-                <w:bottom w:val="none" w:sz="0" w:space="0" w:color="000000"/>
-                <w:top w:val="none" w:sz="0" w:space="0" w:color="000000"/>
-                <w:left w:val="none" w:sz="0" w:space="0" w:color="000000"/>
-                <w:right w:val="none" w:sz="0" w:space="0" w:color="000000"/>
-              </w:pBdr>
-              <w:spacing w:after="100" w:before="100" w:line="240"/>
-              <w:ind w:left="100" w:right="100" w:firstLine="0" w:firstLineChars="0"/>
-              <w:rPr>
-                <w:rFonts w:ascii="Times New Roman" w:hAnsi="Arial" w:eastAsia="Arial" w:cs="Arial"/>
-                <w:i w:val="false"/>
-                <w:b w:val="false"/>
-                <w:u w:val="none"/>
-                <w:strike w:val="false"/>
-                <w:sz w:val="24"/>
-                <w:szCs w:val="24"/>
-                <w:color w:val="000000"/>
-              </w:rPr>
-            </w:pPr>
-            <w:r>
-              <w:rPr>
-                <w:rFonts w:ascii="Times New Roman" w:hAnsi="Arial" w:eastAsia="Arial" w:cs="Arial"/>
-                <w:i w:val="false"/>
-                <w:b w:val="false"/>
-                <w:u w:val="none"/>
-                <w:strike w:val="false"/>
-                <w:sz w:val="24"/>
-                <w:szCs w:val="24"/>
-                <w:color w:val="000000"/>
-              </w:rPr>
-              <w:t xml:space="preserve">122.24</w:t>
+              <w:jc w:val="left"/>
+              <w:pBdr>
+                <w:bottom w:val="none" w:sz="0" w:space="0" w:color="000000"/>
+                <w:top w:val="none" w:sz="0" w:space="0" w:color="000000"/>
+                <w:left w:val="none" w:sz="0" w:space="0" w:color="000000"/>
+                <w:right w:val="none" w:sz="0" w:space="0" w:color="000000"/>
+              </w:pBdr>
+              <w:spacing w:after="100" w:before="100" w:line="240"/>
+              <w:ind w:left="100" w:right="100" w:firstLine="0" w:firstLineChars="0"/>
+              <w:rPr>
+                <w:rFonts w:ascii="Times New Roman" w:hAnsi="Arial" w:eastAsia="Arial" w:cs="Arial"/>
+                <w:i w:val="false"/>
+                <w:b w:val="false"/>
+                <w:u w:val="none"/>
+                <w:strike w:val="false"/>
+                <w:sz w:val="24"/>
+                <w:szCs w:val="24"/>
+                <w:color w:val="000000"/>
+              </w:rPr>
+            </w:pPr>
+            <w:r>
+              <w:rPr>
+                <w:rFonts w:ascii="Times New Roman" w:hAnsi="Arial" w:eastAsia="Arial" w:cs="Arial"/>
+                <w:i w:val="false"/>
+                <w:b w:val="false"/>
+                <w:u w:val="none"/>
+                <w:strike w:val="false"/>
+                <w:sz w:val="24"/>
+                <w:szCs w:val="24"/>
+                <w:color w:val="000000"/>
+              </w:rPr>
+              <w:t xml:space="preserve">122.24%</w:t>
             </w:r>
           </w:p>
         </w:tc>
@@ -2209,906 +2209,6 @@
         <w:tc>
           <w:tcPr>
             <w:tcBorders>
-              <w:bottom w:val="none" w:sz="0" w:space="0" w:color="000000"/>
-              <w:top w:val="none" w:sz="0" w:space="0" w:color="000000"/>
-              <w:left w:val="none" w:sz="0" w:space="0" w:color="000000"/>
-              <w:right w:val="none" w:sz="0" w:space="0" w:color="000000"/>
-            </w:tcBorders>
-            <w:shd w:val="clear" w:color="auto" w:fill="FFFFFF"/>
-            <w:tcMar>
-              <w:top w:w="0" w:type="dxa"/>
-              <w:bottom w:w="0" w:type="dxa"/>
-              <w:left w:w="0" w:type="dxa"/>
-              <w:right w:w="0" w:type="dxa"/>
-            </w:tcMar>
-            <w:vAlign w:val="center"/>
-          </w:tcPr>
-          <w:p>
-            <w:pPr>
-              <w:pStyle w:val="Normal"/>
-              <w:jc w:val="left"/>
-              <w:pBdr>
-                <w:bottom w:val="none" w:sz="0" w:space="0" w:color="000000"/>
-                <w:top w:val="none" w:sz="0" w:space="0" w:color="000000"/>
-                <w:left w:val="none" w:sz="0" w:space="0" w:color="000000"/>
-                <w:right w:val="none" w:sz="0" w:space="0" w:color="000000"/>
-              </w:pBdr>
-              <w:spacing w:after="100" w:before="100" w:line="240"/>
-              <w:ind w:left="100" w:right="100" w:firstLine="0" w:firstLineChars="0"/>
-              <w:rPr>
-                <w:rFonts w:ascii="Times New Roman" w:hAnsi="Arial" w:eastAsia="Arial" w:cs="Arial"/>
-                <w:i w:val="false"/>
-                <w:b w:val="false"/>
-                <w:u w:val="none"/>
-                <w:strike w:val="false"/>
-                <w:sz w:val="24"/>
-                <w:szCs w:val="24"/>
-                <w:color w:val="000000"/>
-              </w:rPr>
-            </w:pPr>
-            <w:r>
-              <w:rPr>
-                <w:rFonts w:ascii="Times New Roman" w:hAnsi="Arial" w:eastAsia="Arial" w:cs="Arial"/>
-                <w:i w:val="false"/>
-                <w:b w:val="false"/>
-                <w:u w:val="none"/>
-                <w:strike w:val="false"/>
-                <w:sz w:val="24"/>
-                <w:szCs w:val="24"/>
-                <w:color w:val="000000"/>
-              </w:rPr>
-              <w:t xml:space="preserve">All ADHD diagnosis-related ICD-10 codes</w:t>
-            </w:r>
-          </w:p>
-        </w:tc>
-        <w:tc>
-          <w:tcPr>
-            <w:tcBorders>
-              <w:bottom w:val="none" w:sz="0" w:space="0" w:color="000000"/>
-              <w:top w:val="none" w:sz="0" w:space="0" w:color="000000"/>
-              <w:left w:val="none" w:sz="0" w:space="0" w:color="000000"/>
-              <w:right w:val="none" w:sz="0" w:space="0" w:color="000000"/>
-            </w:tcBorders>
-            <w:shd w:val="clear" w:color="auto" w:fill="FFFFFF"/>
-            <w:tcMar>
-              <w:top w:w="0" w:type="dxa"/>
-              <w:bottom w:w="0" w:type="dxa"/>
-              <w:left w:w="0" w:type="dxa"/>
-              <w:right w:w="0" w:type="dxa"/>
-            </w:tcMar>
-            <w:vAlign w:val="center"/>
-          </w:tcPr>
-          <w:p>
-            <w:pPr>
-              <w:pStyle w:val="Normal"/>
-              <w:jc w:val="right"/>
-              <w:pBdr>
-                <w:bottom w:val="none" w:sz="0" w:space="0" w:color="000000"/>
-                <w:top w:val="none" w:sz="0" w:space="0" w:color="000000"/>
-                <w:left w:val="none" w:sz="0" w:space="0" w:color="000000"/>
-                <w:right w:val="none" w:sz="0" w:space="0" w:color="000000"/>
-              </w:pBdr>
-              <w:spacing w:after="100" w:before="100" w:line="240"/>
-              <w:ind w:left="100" w:right="100" w:firstLine="0" w:firstLineChars="0"/>
-              <w:rPr>
-                <w:rFonts w:ascii="Times New Roman" w:hAnsi="Arial" w:eastAsia="Arial" w:cs="Arial"/>
-                <w:i w:val="false"/>
-                <w:b w:val="false"/>
-                <w:u w:val="none"/>
-                <w:strike w:val="false"/>
-                <w:sz w:val="24"/>
-                <w:szCs w:val="24"/>
-                <w:color w:val="000000"/>
-              </w:rPr>
-            </w:pPr>
-            <w:r>
-              <w:rPr>
-                <w:rFonts w:ascii="Times New Roman" w:hAnsi="Arial" w:eastAsia="Arial" w:cs="Arial"/>
-                <w:i w:val="false"/>
-                <w:b w:val="false"/>
-                <w:u w:val="none"/>
-                <w:strike w:val="false"/>
-                <w:sz w:val="24"/>
-                <w:szCs w:val="24"/>
-                <w:color w:val="000000"/>
-              </w:rPr>
-              <w:t xml:space="preserve">551,445</w:t>
-            </w:r>
-          </w:p>
-        </w:tc>
-        <w:tc>
-          <w:tcPr>
-            <w:tcBorders>
-              <w:bottom w:val="none" w:sz="0" w:space="0" w:color="000000"/>
-              <w:top w:val="none" w:sz="0" w:space="0" w:color="000000"/>
-              <w:left w:val="none" w:sz="0" w:space="0" w:color="000000"/>
-              <w:right w:val="none" w:sz="0" w:space="0" w:color="000000"/>
-            </w:tcBorders>
-            <w:shd w:val="clear" w:color="auto" w:fill="FFFFFF"/>
-            <w:tcMar>
-              <w:top w:w="0" w:type="dxa"/>
-              <w:bottom w:w="0" w:type="dxa"/>
-              <w:left w:w="0" w:type="dxa"/>
-              <w:right w:w="0" w:type="dxa"/>
-            </w:tcMar>
-            <w:vAlign w:val="center"/>
-          </w:tcPr>
-          <w:p>
-            <w:pPr>
-              <w:pStyle w:val="Normal"/>
-              <w:jc w:val="right"/>
-              <w:pBdr>
-                <w:bottom w:val="none" w:sz="0" w:space="0" w:color="000000"/>
-                <w:top w:val="none" w:sz="0" w:space="0" w:color="000000"/>
-                <w:left w:val="none" w:sz="0" w:space="0" w:color="000000"/>
-                <w:right w:val="none" w:sz="0" w:space="0" w:color="000000"/>
-              </w:pBdr>
-              <w:spacing w:after="100" w:before="100" w:line="240"/>
-              <w:ind w:left="100" w:right="100" w:firstLine="0" w:firstLineChars="0"/>
-              <w:rPr>
-                <w:rFonts w:ascii="Times New Roman" w:hAnsi="Arial" w:eastAsia="Arial" w:cs="Arial"/>
-                <w:i w:val="false"/>
-                <w:b w:val="false"/>
-                <w:u w:val="none"/>
-                <w:strike w:val="false"/>
-                <w:sz w:val="24"/>
-                <w:szCs w:val="24"/>
-                <w:color w:val="000000"/>
-              </w:rPr>
-            </w:pPr>
-            <w:r>
-              <w:rPr>
-                <w:rFonts w:ascii="Times New Roman" w:hAnsi="Arial" w:eastAsia="Arial" w:cs="Arial"/>
-                <w:i w:val="false"/>
-                <w:b w:val="false"/>
-                <w:u w:val="none"/>
-                <w:strike w:val="false"/>
-                <w:sz w:val="24"/>
-                <w:szCs w:val="24"/>
-                <w:color w:val="000000"/>
-              </w:rPr>
-              <w:t xml:space="preserve">100.00</w:t>
-            </w:r>
-          </w:p>
-        </w:tc>
-        <w:tc>
-          <w:tcPr>
-            <w:tcBorders>
-              <w:bottom w:val="none" w:sz="0" w:space="0" w:color="000000"/>
-              <w:top w:val="none" w:sz="0" w:space="0" w:color="000000"/>
-              <w:left w:val="none" w:sz="0" w:space="0" w:color="000000"/>
-              <w:right w:val="none" w:sz="0" w:space="0" w:color="000000"/>
-            </w:tcBorders>
-            <w:shd w:val="clear" w:color="auto" w:fill="FFFFFF"/>
-            <w:tcMar>
-              <w:top w:w="0" w:type="dxa"/>
-              <w:bottom w:w="0" w:type="dxa"/>
-              <w:left w:w="0" w:type="dxa"/>
-              <w:right w:w="0" w:type="dxa"/>
-            </w:tcMar>
-            <w:vAlign w:val="center"/>
-          </w:tcPr>
-          <w:p>
-            <w:pPr>
-              <w:pStyle w:val="Normal"/>
-              <w:jc w:val="right"/>
-              <w:pBdr>
-                <w:bottom w:val="none" w:sz="0" w:space="0" w:color="000000"/>
-                <w:top w:val="none" w:sz="0" w:space="0" w:color="000000"/>
-                <w:left w:val="none" w:sz="0" w:space="0" w:color="000000"/>
-                <w:right w:val="none" w:sz="0" w:space="0" w:color="000000"/>
-              </w:pBdr>
-              <w:spacing w:after="100" w:before="100" w:line="240"/>
-              <w:ind w:left="100" w:right="100" w:firstLine="0" w:firstLineChars="0"/>
-              <w:rPr>
-                <w:rFonts w:ascii="Times New Roman" w:hAnsi="Arial" w:eastAsia="Arial" w:cs="Arial"/>
-                <w:i w:val="false"/>
-                <w:b w:val="false"/>
-                <w:u w:val="none"/>
-                <w:strike w:val="false"/>
-                <w:sz w:val="24"/>
-                <w:szCs w:val="24"/>
-                <w:color w:val="000000"/>
-              </w:rPr>
-            </w:pPr>
-            <w:r>
-              <w:rPr>
-                <w:rFonts w:ascii="Times New Roman" w:hAnsi="Arial" w:eastAsia="Arial" w:cs="Arial"/>
-                <w:i w:val="false"/>
-                <w:b w:val="false"/>
-                <w:u w:val="none"/>
-                <w:strike w:val="false"/>
-                <w:sz w:val="24"/>
-                <w:szCs w:val="24"/>
-                <w:color w:val="000000"/>
-              </w:rPr>
-              <w:t xml:space="preserve">1,035.65</w:t>
-            </w:r>
-          </w:p>
-        </w:tc>
-      </w:tr>
-      <w:tr>
-        <w:trPr>
-          <w:trHeight w:val="360" w:hRule="auto"/>
-        </w:trPr>
-        <w:tc>
-          <w:tcPr>
-            <w:tcBorders>
-              <w:bottom w:val="none" w:sz="0" w:space="0" w:color="000000"/>
-              <w:top w:val="none" w:sz="0" w:space="0" w:color="000000"/>
-              <w:left w:val="none" w:sz="0" w:space="0" w:color="000000"/>
-              <w:right w:val="none" w:sz="0" w:space="0" w:color="000000"/>
-            </w:tcBorders>
-            <w:shd w:val="clear" w:color="auto" w:fill="FFFFFF"/>
-            <w:tcMar>
-              <w:top w:w="0" w:type="dxa"/>
-              <w:bottom w:w="0" w:type="dxa"/>
-              <w:left w:w="0" w:type="dxa"/>
-              <w:right w:w="0" w:type="dxa"/>
-            </w:tcMar>
-            <w:vAlign w:val="center"/>
-          </w:tcPr>
-          <w:p>
-            <w:pPr>
-              <w:pStyle w:val="Normal"/>
-              <w:jc w:val="left"/>
-              <w:pBdr>
-                <w:bottom w:val="none" w:sz="0" w:space="0" w:color="000000"/>
-                <w:top w:val="none" w:sz="0" w:space="0" w:color="000000"/>
-                <w:left w:val="none" w:sz="0" w:space="0" w:color="000000"/>
-                <w:right w:val="none" w:sz="0" w:space="0" w:color="000000"/>
-              </w:pBdr>
-              <w:spacing w:after="100" w:before="100" w:line="240"/>
-              <w:ind w:left="100" w:right="100" w:firstLine="0" w:firstLineChars="0"/>
-              <w:rPr>
-                <w:rFonts w:ascii="Times New Roman" w:hAnsi="Arial" w:eastAsia="Arial" w:cs="Arial"/>
-                <w:i w:val="false"/>
-                <w:b w:val="false"/>
-                <w:u w:val="none"/>
-                <w:strike w:val="false"/>
-                <w:sz w:val="24"/>
-                <w:szCs w:val="24"/>
-                <w:color w:val="000000"/>
-              </w:rPr>
-            </w:pPr>
-            <w:r>
-              <w:rPr>
-                <w:rFonts w:ascii="Times New Roman" w:hAnsi="Arial" w:eastAsia="Arial" w:cs="Arial"/>
-                <w:i w:val="false"/>
-                <w:b w:val="false"/>
-                <w:u w:val="none"/>
-                <w:strike w:val="false"/>
-                <w:sz w:val="24"/>
-                <w:szCs w:val="24"/>
-                <w:color w:val="000000"/>
-              </w:rPr>
-              <w:t xml:space="preserve">Disturbance of activity and attention</w:t>
-            </w:r>
-          </w:p>
-        </w:tc>
-        <w:tc>
-          <w:tcPr>
-            <w:tcBorders>
-              <w:bottom w:val="none" w:sz="0" w:space="0" w:color="000000"/>
-              <w:top w:val="none" w:sz="0" w:space="0" w:color="000000"/>
-              <w:left w:val="none" w:sz="0" w:space="0" w:color="000000"/>
-              <w:right w:val="none" w:sz="0" w:space="0" w:color="000000"/>
-            </w:tcBorders>
-            <w:shd w:val="clear" w:color="auto" w:fill="FFFFFF"/>
-            <w:tcMar>
-              <w:top w:w="0" w:type="dxa"/>
-              <w:bottom w:w="0" w:type="dxa"/>
-              <w:left w:w="0" w:type="dxa"/>
-              <w:right w:w="0" w:type="dxa"/>
-            </w:tcMar>
-            <w:vAlign w:val="center"/>
-          </w:tcPr>
-          <w:p>
-            <w:pPr>
-              <w:pStyle w:val="Normal"/>
-              <w:jc w:val="right"/>
-              <w:pBdr>
-                <w:bottom w:val="none" w:sz="0" w:space="0" w:color="000000"/>
-                <w:top w:val="none" w:sz="0" w:space="0" w:color="000000"/>
-                <w:left w:val="none" w:sz="0" w:space="0" w:color="000000"/>
-                <w:right w:val="none" w:sz="0" w:space="0" w:color="000000"/>
-              </w:pBdr>
-              <w:spacing w:after="100" w:before="100" w:line="240"/>
-              <w:ind w:left="100" w:right="100" w:firstLine="0" w:firstLineChars="0"/>
-              <w:rPr>
-                <w:rFonts w:ascii="Times New Roman" w:hAnsi="Arial" w:eastAsia="Arial" w:cs="Arial"/>
-                <w:i w:val="false"/>
-                <w:b w:val="false"/>
-                <w:u w:val="none"/>
-                <w:strike w:val="false"/>
-                <w:sz w:val="24"/>
-                <w:szCs w:val="24"/>
-                <w:color w:val="000000"/>
-              </w:rPr>
-            </w:pPr>
-            <w:r>
-              <w:rPr>
-                <w:rFonts w:ascii="Times New Roman" w:hAnsi="Arial" w:eastAsia="Arial" w:cs="Arial"/>
-                <w:i w:val="false"/>
-                <w:b w:val="false"/>
-                <w:u w:val="none"/>
-                <w:strike w:val="false"/>
-                <w:sz w:val="24"/>
-                <w:szCs w:val="24"/>
-                <w:color w:val="000000"/>
-              </w:rPr>
-              <w:t xml:space="preserve">538,927</w:t>
-            </w:r>
-          </w:p>
-        </w:tc>
-        <w:tc>
-          <w:tcPr>
-            <w:tcBorders>
-              <w:bottom w:val="none" w:sz="0" w:space="0" w:color="000000"/>
-              <w:top w:val="none" w:sz="0" w:space="0" w:color="000000"/>
-              <w:left w:val="none" w:sz="0" w:space="0" w:color="000000"/>
-              <w:right w:val="none" w:sz="0" w:space="0" w:color="000000"/>
-            </w:tcBorders>
-            <w:shd w:val="clear" w:color="auto" w:fill="FFFFFF"/>
-            <w:tcMar>
-              <w:top w:w="0" w:type="dxa"/>
-              <w:bottom w:w="0" w:type="dxa"/>
-              <w:left w:w="0" w:type="dxa"/>
-              <w:right w:w="0" w:type="dxa"/>
-            </w:tcMar>
-            <w:vAlign w:val="center"/>
-          </w:tcPr>
-          <w:p>
-            <w:pPr>
-              <w:pStyle w:val="Normal"/>
-              <w:jc w:val="right"/>
-              <w:pBdr>
-                <w:bottom w:val="none" w:sz="0" w:space="0" w:color="000000"/>
-                <w:top w:val="none" w:sz="0" w:space="0" w:color="000000"/>
-                <w:left w:val="none" w:sz="0" w:space="0" w:color="000000"/>
-                <w:right w:val="none" w:sz="0" w:space="0" w:color="000000"/>
-              </w:pBdr>
-              <w:spacing w:after="100" w:before="100" w:line="240"/>
-              <w:ind w:left="100" w:right="100" w:firstLine="0" w:firstLineChars="0"/>
-              <w:rPr>
-                <w:rFonts w:ascii="Times New Roman" w:hAnsi="Arial" w:eastAsia="Arial" w:cs="Arial"/>
-                <w:i w:val="false"/>
-                <w:b w:val="false"/>
-                <w:u w:val="none"/>
-                <w:strike w:val="false"/>
-                <w:sz w:val="24"/>
-                <w:szCs w:val="24"/>
-                <w:color w:val="000000"/>
-              </w:rPr>
-            </w:pPr>
-            <w:r>
-              <w:rPr>
-                <w:rFonts w:ascii="Times New Roman" w:hAnsi="Arial" w:eastAsia="Arial" w:cs="Arial"/>
-                <w:i w:val="false"/>
-                <w:b w:val="false"/>
-                <w:u w:val="none"/>
-                <w:strike w:val="false"/>
-                <w:sz w:val="24"/>
-                <w:szCs w:val="24"/>
-                <w:color w:val="000000"/>
-              </w:rPr>
-              <w:t xml:space="preserve">97.73</w:t>
-            </w:r>
-          </w:p>
-        </w:tc>
-        <w:tc>
-          <w:tcPr>
-            <w:tcBorders>
-              <w:bottom w:val="none" w:sz="0" w:space="0" w:color="000000"/>
-              <w:top w:val="none" w:sz="0" w:space="0" w:color="000000"/>
-              <w:left w:val="none" w:sz="0" w:space="0" w:color="000000"/>
-              <w:right w:val="none" w:sz="0" w:space="0" w:color="000000"/>
-            </w:tcBorders>
-            <w:shd w:val="clear" w:color="auto" w:fill="FFFFFF"/>
-            <w:tcMar>
-              <w:top w:w="0" w:type="dxa"/>
-              <w:bottom w:w="0" w:type="dxa"/>
-              <w:left w:w="0" w:type="dxa"/>
-              <w:right w:w="0" w:type="dxa"/>
-            </w:tcMar>
-            <w:vAlign w:val="center"/>
-          </w:tcPr>
-          <w:p>
-            <w:pPr>
-              <w:pStyle w:val="Normal"/>
-              <w:jc w:val="right"/>
-              <w:pBdr>
-                <w:bottom w:val="none" w:sz="0" w:space="0" w:color="000000"/>
-                <w:top w:val="none" w:sz="0" w:space="0" w:color="000000"/>
-                <w:left w:val="none" w:sz="0" w:space="0" w:color="000000"/>
-                <w:right w:val="none" w:sz="0" w:space="0" w:color="000000"/>
-              </w:pBdr>
-              <w:spacing w:after="100" w:before="100" w:line="240"/>
-              <w:ind w:left="100" w:right="100" w:firstLine="0" w:firstLineChars="0"/>
-              <w:rPr>
-                <w:rFonts w:ascii="Times New Roman" w:hAnsi="Arial" w:eastAsia="Arial" w:cs="Arial"/>
-                <w:i w:val="false"/>
-                <w:b w:val="false"/>
-                <w:u w:val="none"/>
-                <w:strike w:val="false"/>
-                <w:sz w:val="24"/>
-                <w:szCs w:val="24"/>
-                <w:color w:val="000000"/>
-              </w:rPr>
-            </w:pPr>
-            <w:r>
-              <w:rPr>
-                <w:rFonts w:ascii="Times New Roman" w:hAnsi="Arial" w:eastAsia="Arial" w:cs="Arial"/>
-                <w:i w:val="false"/>
-                <w:b w:val="false"/>
-                <w:u w:val="none"/>
-                <w:strike w:val="false"/>
-                <w:sz w:val="24"/>
-                <w:szCs w:val="24"/>
-                <w:color w:val="000000"/>
-              </w:rPr>
-              <w:t xml:space="preserve">1,061.40</w:t>
-            </w:r>
-          </w:p>
-        </w:tc>
-      </w:tr>
-      <w:tr>
-        <w:trPr>
-          <w:trHeight w:val="360" w:hRule="auto"/>
-        </w:trPr>
-        <w:tc>
-          <w:tcPr>
-            <w:tcBorders>
-              <w:bottom w:val="none" w:sz="0" w:space="0" w:color="000000"/>
-              <w:top w:val="none" w:sz="0" w:space="0" w:color="000000"/>
-              <w:left w:val="none" w:sz="0" w:space="0" w:color="000000"/>
-              <w:right w:val="none" w:sz="0" w:space="0" w:color="000000"/>
-            </w:tcBorders>
-            <w:shd w:val="clear" w:color="auto" w:fill="FFFFFF"/>
-            <w:tcMar>
-              <w:top w:w="0" w:type="dxa"/>
-              <w:bottom w:w="0" w:type="dxa"/>
-              <w:left w:w="0" w:type="dxa"/>
-              <w:right w:w="0" w:type="dxa"/>
-            </w:tcMar>
-            <w:vAlign w:val="center"/>
-          </w:tcPr>
-          <w:p>
-            <w:pPr>
-              <w:pStyle w:val="Normal"/>
-              <w:jc w:val="left"/>
-              <w:pBdr>
-                <w:bottom w:val="none" w:sz="0" w:space="0" w:color="000000"/>
-                <w:top w:val="none" w:sz="0" w:space="0" w:color="000000"/>
-                <w:left w:val="none" w:sz="0" w:space="0" w:color="000000"/>
-                <w:right w:val="none" w:sz="0" w:space="0" w:color="000000"/>
-              </w:pBdr>
-              <w:spacing w:after="100" w:before="100" w:line="240"/>
-              <w:ind w:left="100" w:right="100" w:firstLine="0" w:firstLineChars="0"/>
-              <w:rPr>
-                <w:rFonts w:ascii="Times New Roman" w:hAnsi="Arial" w:eastAsia="Arial" w:cs="Arial"/>
-                <w:i w:val="false"/>
-                <w:b w:val="false"/>
-                <w:u w:val="none"/>
-                <w:strike w:val="false"/>
-                <w:sz w:val="24"/>
-                <w:szCs w:val="24"/>
-                <w:color w:val="000000"/>
-              </w:rPr>
-            </w:pPr>
-            <w:r>
-              <w:rPr>
-                <w:rFonts w:ascii="Times New Roman" w:hAnsi="Arial" w:eastAsia="Arial" w:cs="Arial"/>
-                <w:i w:val="false"/>
-                <w:b w:val="false"/>
-                <w:u w:val="none"/>
-                <w:strike w:val="false"/>
-                <w:sz w:val="24"/>
-                <w:szCs w:val="24"/>
-                <w:color w:val="000000"/>
-              </w:rPr>
-              <w:t xml:space="preserve">Hyperkinetic disorder, unspecified</w:t>
-            </w:r>
-          </w:p>
-        </w:tc>
-        <w:tc>
-          <w:tcPr>
-            <w:tcBorders>
-              <w:bottom w:val="none" w:sz="0" w:space="0" w:color="000000"/>
-              <w:top w:val="none" w:sz="0" w:space="0" w:color="000000"/>
-              <w:left w:val="none" w:sz="0" w:space="0" w:color="000000"/>
-              <w:right w:val="none" w:sz="0" w:space="0" w:color="000000"/>
-            </w:tcBorders>
-            <w:shd w:val="clear" w:color="auto" w:fill="FFFFFF"/>
-            <w:tcMar>
-              <w:top w:w="0" w:type="dxa"/>
-              <w:bottom w:w="0" w:type="dxa"/>
-              <w:left w:w="0" w:type="dxa"/>
-              <w:right w:w="0" w:type="dxa"/>
-            </w:tcMar>
-            <w:vAlign w:val="center"/>
-          </w:tcPr>
-          <w:p>
-            <w:pPr>
-              <w:pStyle w:val="Normal"/>
-              <w:jc w:val="right"/>
-              <w:pBdr>
-                <w:bottom w:val="none" w:sz="0" w:space="0" w:color="000000"/>
-                <w:top w:val="none" w:sz="0" w:space="0" w:color="000000"/>
-                <w:left w:val="none" w:sz="0" w:space="0" w:color="000000"/>
-                <w:right w:val="none" w:sz="0" w:space="0" w:color="000000"/>
-              </w:pBdr>
-              <w:spacing w:after="100" w:before="100" w:line="240"/>
-              <w:ind w:left="100" w:right="100" w:firstLine="0" w:firstLineChars="0"/>
-              <w:rPr>
-                <w:rFonts w:ascii="Times New Roman" w:hAnsi="Arial" w:eastAsia="Arial" w:cs="Arial"/>
-                <w:i w:val="false"/>
-                <w:b w:val="false"/>
-                <w:u w:val="none"/>
-                <w:strike w:val="false"/>
-                <w:sz w:val="24"/>
-                <w:szCs w:val="24"/>
-                <w:color w:val="000000"/>
-              </w:rPr>
-            </w:pPr>
-            <w:r>
-              <w:rPr>
-                <w:rFonts w:ascii="Times New Roman" w:hAnsi="Arial" w:eastAsia="Arial" w:cs="Arial"/>
-                <w:i w:val="false"/>
-                <w:b w:val="false"/>
-                <w:u w:val="none"/>
-                <w:strike w:val="false"/>
-                <w:sz w:val="24"/>
-                <w:szCs w:val="24"/>
-                <w:color w:val="000000"/>
-              </w:rPr>
-              <w:t xml:space="preserve">10,183</w:t>
-            </w:r>
-          </w:p>
-        </w:tc>
-        <w:tc>
-          <w:tcPr>
-            <w:tcBorders>
-              <w:bottom w:val="none" w:sz="0" w:space="0" w:color="000000"/>
-              <w:top w:val="none" w:sz="0" w:space="0" w:color="000000"/>
-              <w:left w:val="none" w:sz="0" w:space="0" w:color="000000"/>
-              <w:right w:val="none" w:sz="0" w:space="0" w:color="000000"/>
-            </w:tcBorders>
-            <w:shd w:val="clear" w:color="auto" w:fill="FFFFFF"/>
-            <w:tcMar>
-              <w:top w:w="0" w:type="dxa"/>
-              <w:bottom w:w="0" w:type="dxa"/>
-              <w:left w:w="0" w:type="dxa"/>
-              <w:right w:w="0" w:type="dxa"/>
-            </w:tcMar>
-            <w:vAlign w:val="center"/>
-          </w:tcPr>
-          <w:p>
-            <w:pPr>
-              <w:pStyle w:val="Normal"/>
-              <w:jc w:val="right"/>
-              <w:pBdr>
-                <w:bottom w:val="none" w:sz="0" w:space="0" w:color="000000"/>
-                <w:top w:val="none" w:sz="0" w:space="0" w:color="000000"/>
-                <w:left w:val="none" w:sz="0" w:space="0" w:color="000000"/>
-                <w:right w:val="none" w:sz="0" w:space="0" w:color="000000"/>
-              </w:pBdr>
-              <w:spacing w:after="100" w:before="100" w:line="240"/>
-              <w:ind w:left="100" w:right="100" w:firstLine="0" w:firstLineChars="0"/>
-              <w:rPr>
-                <w:rFonts w:ascii="Times New Roman" w:hAnsi="Arial" w:eastAsia="Arial" w:cs="Arial"/>
-                <w:i w:val="false"/>
-                <w:b w:val="false"/>
-                <w:u w:val="none"/>
-                <w:strike w:val="false"/>
-                <w:sz w:val="24"/>
-                <w:szCs w:val="24"/>
-                <w:color w:val="000000"/>
-              </w:rPr>
-            </w:pPr>
-            <w:r>
-              <w:rPr>
-                <w:rFonts w:ascii="Times New Roman" w:hAnsi="Arial" w:eastAsia="Arial" w:cs="Arial"/>
-                <w:i w:val="false"/>
-                <w:b w:val="false"/>
-                <w:u w:val="none"/>
-                <w:strike w:val="false"/>
-                <w:sz w:val="24"/>
-                <w:szCs w:val="24"/>
-                <w:color w:val="000000"/>
-              </w:rPr>
-              <w:t xml:space="preserve">1.85</w:t>
-            </w:r>
-          </w:p>
-        </w:tc>
-        <w:tc>
-          <w:tcPr>
-            <w:tcBorders>
-              <w:bottom w:val="none" w:sz="0" w:space="0" w:color="000000"/>
-              <w:top w:val="none" w:sz="0" w:space="0" w:color="000000"/>
-              <w:left w:val="none" w:sz="0" w:space="0" w:color="000000"/>
-              <w:right w:val="none" w:sz="0" w:space="0" w:color="000000"/>
-            </w:tcBorders>
-            <w:shd w:val="clear" w:color="auto" w:fill="FFFFFF"/>
-            <w:tcMar>
-              <w:top w:w="0" w:type="dxa"/>
-              <w:bottom w:w="0" w:type="dxa"/>
-              <w:left w:w="0" w:type="dxa"/>
-              <w:right w:w="0" w:type="dxa"/>
-            </w:tcMar>
-            <w:vAlign w:val="center"/>
-          </w:tcPr>
-          <w:p>
-            <w:pPr>
-              <w:pStyle w:val="Normal"/>
-              <w:jc w:val="right"/>
-              <w:pBdr>
-                <w:bottom w:val="none" w:sz="0" w:space="0" w:color="000000"/>
-                <w:top w:val="none" w:sz="0" w:space="0" w:color="000000"/>
-                <w:left w:val="none" w:sz="0" w:space="0" w:color="000000"/>
-                <w:right w:val="none" w:sz="0" w:space="0" w:color="000000"/>
-              </w:pBdr>
-              <w:spacing w:after="100" w:before="100" w:line="240"/>
-              <w:ind w:left="100" w:right="100" w:firstLine="0" w:firstLineChars="0"/>
-              <w:rPr>
-                <w:rFonts w:ascii="Times New Roman" w:hAnsi="Arial" w:eastAsia="Arial" w:cs="Arial"/>
-                <w:i w:val="false"/>
-                <w:b w:val="false"/>
-                <w:u w:val="none"/>
-                <w:strike w:val="false"/>
-                <w:sz w:val="24"/>
-                <w:szCs w:val="24"/>
-                <w:color w:val="000000"/>
-              </w:rPr>
-            </w:pPr>
-            <w:r>
-              <w:rPr>
-                <w:rFonts w:ascii="Times New Roman" w:hAnsi="Arial" w:eastAsia="Arial" w:cs="Arial"/>
-                <w:i w:val="false"/>
-                <w:b w:val="false"/>
-                <w:u w:val="none"/>
-                <w:strike w:val="false"/>
-                <w:sz w:val="24"/>
-                <w:szCs w:val="24"/>
-                <w:color w:val="000000"/>
-              </w:rPr>
-              <w:t xml:space="preserve">414.81</w:t>
-            </w:r>
-          </w:p>
-        </w:tc>
-      </w:tr>
-      <w:tr>
-        <w:trPr>
-          <w:trHeight w:val="360" w:hRule="auto"/>
-        </w:trPr>
-        <w:tc>
-          <w:tcPr>
-            <w:tcBorders>
-              <w:bottom w:val="none" w:sz="0" w:space="0" w:color="000000"/>
-              <w:top w:val="none" w:sz="0" w:space="0" w:color="000000"/>
-              <w:left w:val="none" w:sz="0" w:space="0" w:color="000000"/>
-              <w:right w:val="none" w:sz="0" w:space="0" w:color="000000"/>
-            </w:tcBorders>
-            <w:shd w:val="clear" w:color="auto" w:fill="FFFFFF"/>
-            <w:tcMar>
-              <w:top w:w="0" w:type="dxa"/>
-              <w:bottom w:w="0" w:type="dxa"/>
-              <w:left w:w="0" w:type="dxa"/>
-              <w:right w:w="0" w:type="dxa"/>
-            </w:tcMar>
-            <w:vAlign w:val="center"/>
-          </w:tcPr>
-          <w:p>
-            <w:pPr>
-              <w:pStyle w:val="Normal"/>
-              <w:jc w:val="left"/>
-              <w:pBdr>
-                <w:bottom w:val="none" w:sz="0" w:space="0" w:color="000000"/>
-                <w:top w:val="none" w:sz="0" w:space="0" w:color="000000"/>
-                <w:left w:val="none" w:sz="0" w:space="0" w:color="000000"/>
-                <w:right w:val="none" w:sz="0" w:space="0" w:color="000000"/>
-              </w:pBdr>
-              <w:spacing w:after="100" w:before="100" w:line="240"/>
-              <w:ind w:left="100" w:right="100" w:firstLine="0" w:firstLineChars="0"/>
-              <w:rPr>
-                <w:rFonts w:ascii="Times New Roman" w:hAnsi="Arial" w:eastAsia="Arial" w:cs="Arial"/>
-                <w:i w:val="false"/>
-                <w:b w:val="false"/>
-                <w:u w:val="none"/>
-                <w:strike w:val="false"/>
-                <w:sz w:val="24"/>
-                <w:szCs w:val="24"/>
-                <w:color w:val="000000"/>
-              </w:rPr>
-            </w:pPr>
-            <w:r>
-              <w:rPr>
-                <w:rFonts w:ascii="Times New Roman" w:hAnsi="Arial" w:eastAsia="Arial" w:cs="Arial"/>
-                <w:i w:val="false"/>
-                <w:b w:val="false"/>
-                <w:u w:val="none"/>
-                <w:strike w:val="false"/>
-                <w:sz w:val="24"/>
-                <w:szCs w:val="24"/>
-                <w:color w:val="000000"/>
-              </w:rPr>
-              <w:t xml:space="preserve">Hyperkinetic conduct disorder</w:t>
-            </w:r>
-          </w:p>
-        </w:tc>
-        <w:tc>
-          <w:tcPr>
-            <w:tcBorders>
-              <w:bottom w:val="none" w:sz="0" w:space="0" w:color="000000"/>
-              <w:top w:val="none" w:sz="0" w:space="0" w:color="000000"/>
-              <w:left w:val="none" w:sz="0" w:space="0" w:color="000000"/>
-              <w:right w:val="none" w:sz="0" w:space="0" w:color="000000"/>
-            </w:tcBorders>
-            <w:shd w:val="clear" w:color="auto" w:fill="FFFFFF"/>
-            <w:tcMar>
-              <w:top w:w="0" w:type="dxa"/>
-              <w:bottom w:w="0" w:type="dxa"/>
-              <w:left w:w="0" w:type="dxa"/>
-              <w:right w:w="0" w:type="dxa"/>
-            </w:tcMar>
-            <w:vAlign w:val="center"/>
-          </w:tcPr>
-          <w:p>
-            <w:pPr>
-              <w:pStyle w:val="Normal"/>
-              <w:jc w:val="right"/>
-              <w:pBdr>
-                <w:bottom w:val="none" w:sz="0" w:space="0" w:color="000000"/>
-                <w:top w:val="none" w:sz="0" w:space="0" w:color="000000"/>
-                <w:left w:val="none" w:sz="0" w:space="0" w:color="000000"/>
-                <w:right w:val="none" w:sz="0" w:space="0" w:color="000000"/>
-              </w:pBdr>
-              <w:spacing w:after="100" w:before="100" w:line="240"/>
-              <w:ind w:left="100" w:right="100" w:firstLine="0" w:firstLineChars="0"/>
-              <w:rPr>
-                <w:rFonts w:ascii="Times New Roman" w:hAnsi="Arial" w:eastAsia="Arial" w:cs="Arial"/>
-                <w:i w:val="false"/>
-                <w:b w:val="false"/>
-                <w:u w:val="none"/>
-                <w:strike w:val="false"/>
-                <w:sz w:val="24"/>
-                <w:szCs w:val="24"/>
-                <w:color w:val="000000"/>
-              </w:rPr>
-            </w:pPr>
-            <w:r>
-              <w:rPr>
-                <w:rFonts w:ascii="Times New Roman" w:hAnsi="Arial" w:eastAsia="Arial" w:cs="Arial"/>
-                <w:i w:val="false"/>
-                <w:b w:val="false"/>
-                <w:u w:val="none"/>
-                <w:strike w:val="false"/>
-                <w:sz w:val="24"/>
-                <w:szCs w:val="24"/>
-                <w:color w:val="000000"/>
-              </w:rPr>
-              <w:t xml:space="preserve">1,686</w:t>
-            </w:r>
-          </w:p>
-        </w:tc>
-        <w:tc>
-          <w:tcPr>
-            <w:tcBorders>
-              <w:bottom w:val="none" w:sz="0" w:space="0" w:color="000000"/>
-              <w:top w:val="none" w:sz="0" w:space="0" w:color="000000"/>
-              <w:left w:val="none" w:sz="0" w:space="0" w:color="000000"/>
-              <w:right w:val="none" w:sz="0" w:space="0" w:color="000000"/>
-            </w:tcBorders>
-            <w:shd w:val="clear" w:color="auto" w:fill="FFFFFF"/>
-            <w:tcMar>
-              <w:top w:w="0" w:type="dxa"/>
-              <w:bottom w:w="0" w:type="dxa"/>
-              <w:left w:w="0" w:type="dxa"/>
-              <w:right w:w="0" w:type="dxa"/>
-            </w:tcMar>
-            <w:vAlign w:val="center"/>
-          </w:tcPr>
-          <w:p>
-            <w:pPr>
-              <w:pStyle w:val="Normal"/>
-              <w:jc w:val="right"/>
-              <w:pBdr>
-                <w:bottom w:val="none" w:sz="0" w:space="0" w:color="000000"/>
-                <w:top w:val="none" w:sz="0" w:space="0" w:color="000000"/>
-                <w:left w:val="none" w:sz="0" w:space="0" w:color="000000"/>
-                <w:right w:val="none" w:sz="0" w:space="0" w:color="000000"/>
-              </w:pBdr>
-              <w:spacing w:after="100" w:before="100" w:line="240"/>
-              <w:ind w:left="100" w:right="100" w:firstLine="0" w:firstLineChars="0"/>
-              <w:rPr>
-                <w:rFonts w:ascii="Times New Roman" w:hAnsi="Arial" w:eastAsia="Arial" w:cs="Arial"/>
-                <w:i w:val="false"/>
-                <w:b w:val="false"/>
-                <w:u w:val="none"/>
-                <w:strike w:val="false"/>
-                <w:sz w:val="24"/>
-                <w:szCs w:val="24"/>
-                <w:color w:val="000000"/>
-              </w:rPr>
-            </w:pPr>
-            <w:r>
-              <w:rPr>
-                <w:rFonts w:ascii="Times New Roman" w:hAnsi="Arial" w:eastAsia="Arial" w:cs="Arial"/>
-                <w:i w:val="false"/>
-                <w:b w:val="false"/>
-                <w:u w:val="none"/>
-                <w:strike w:val="false"/>
-                <w:sz w:val="24"/>
-                <w:szCs w:val="24"/>
-                <w:color w:val="000000"/>
-              </w:rPr>
-              <w:t xml:space="preserve">0.31</w:t>
-            </w:r>
-          </w:p>
-        </w:tc>
-        <w:tc>
-          <w:tcPr>
-            <w:tcBorders>
-              <w:bottom w:val="none" w:sz="0" w:space="0" w:color="000000"/>
-              <w:top w:val="none" w:sz="0" w:space="0" w:color="000000"/>
-              <w:left w:val="none" w:sz="0" w:space="0" w:color="000000"/>
-              <w:right w:val="none" w:sz="0" w:space="0" w:color="000000"/>
-            </w:tcBorders>
-            <w:shd w:val="clear" w:color="auto" w:fill="FFFFFF"/>
-            <w:tcMar>
-              <w:top w:w="0" w:type="dxa"/>
-              <w:bottom w:w="0" w:type="dxa"/>
-              <w:left w:w="0" w:type="dxa"/>
-              <w:right w:w="0" w:type="dxa"/>
-            </w:tcMar>
-            <w:vAlign w:val="center"/>
-          </w:tcPr>
-          <w:p>
-            <w:pPr>
-              <w:pStyle w:val="Normal"/>
-              <w:jc w:val="right"/>
-              <w:pBdr>
-                <w:bottom w:val="none" w:sz="0" w:space="0" w:color="000000"/>
-                <w:top w:val="none" w:sz="0" w:space="0" w:color="000000"/>
-                <w:left w:val="none" w:sz="0" w:space="0" w:color="000000"/>
-                <w:right w:val="none" w:sz="0" w:space="0" w:color="000000"/>
-              </w:pBdr>
-              <w:spacing w:after="100" w:before="100" w:line="240"/>
-              <w:ind w:left="100" w:right="100" w:firstLine="0" w:firstLineChars="0"/>
-              <w:rPr>
-                <w:rFonts w:ascii="Times New Roman" w:hAnsi="Arial" w:eastAsia="Arial" w:cs="Arial"/>
-                <w:i w:val="false"/>
-                <w:b w:val="false"/>
-                <w:u w:val="none"/>
-                <w:strike w:val="false"/>
-                <w:sz w:val="24"/>
-                <w:szCs w:val="24"/>
-                <w:color w:val="000000"/>
-              </w:rPr>
-            </w:pPr>
-            <w:r>
-              <w:rPr>
-                <w:rFonts w:ascii="Times New Roman" w:hAnsi="Arial" w:eastAsia="Arial" w:cs="Arial"/>
-                <w:i w:val="false"/>
-                <w:b w:val="false"/>
-                <w:u w:val="none"/>
-                <w:strike w:val="false"/>
-                <w:sz w:val="24"/>
-                <w:szCs w:val="24"/>
-                <w:color w:val="000000"/>
-              </w:rPr>
-              <w:t xml:space="preserve">406.98</w:t>
-            </w:r>
-          </w:p>
-        </w:tc>
-      </w:tr>
-      <w:tr>
-        <w:trPr>
-          <w:trHeight w:val="360" w:hRule="auto"/>
-        </w:trPr>
-        <w:tc>
-          <w:tcPr>
-            <w:tcBorders>
               <w:bottom w:val="single" w:sz="12" w:space="0" w:color="666666"/>
               <w:top w:val="none" w:sz="0" w:space="0" w:color="000000"/>
               <w:left w:val="none" w:sz="0" w:space="0" w:color="000000"/>
@@ -3157,7 +2257,7 @@
                 <w:szCs w:val="24"/>
                 <w:color w:val="000000"/>
               </w:rPr>
-              <w:t xml:space="preserve">Other hyperkinetic disorders</w:t>
+              <w:t xml:space="preserve">F90.0 Disturbance of activity and attention</w:t>
             </w:r>
           </w:p>
         </w:tc>
@@ -3212,7 +2312,7 @@
                 <w:szCs w:val="24"/>
                 <w:color w:val="000000"/>
               </w:rPr>
-              <w:t xml:space="preserve">649</w:t>
+              <w:t xml:space="preserve">538,927</w:t>
             </w:r>
           </w:p>
         </w:tc>
@@ -3236,38 +2336,38 @@
           <w:p>
             <w:pPr>
               <w:pStyle w:val="Normal"/>
-              <w:jc w:val="right"/>
-              <w:pBdr>
-                <w:bottom w:val="none" w:sz="0" w:space="0" w:color="000000"/>
-                <w:top w:val="none" w:sz="0" w:space="0" w:color="000000"/>
-                <w:left w:val="none" w:sz="0" w:space="0" w:color="000000"/>
-                <w:right w:val="none" w:sz="0" w:space="0" w:color="000000"/>
-              </w:pBdr>
-              <w:spacing w:after="100" w:before="100" w:line="240"/>
-              <w:ind w:left="100" w:right="100" w:firstLine="0" w:firstLineChars="0"/>
-              <w:rPr>
-                <w:rFonts w:ascii="Times New Roman" w:hAnsi="Arial" w:eastAsia="Arial" w:cs="Arial"/>
-                <w:i w:val="false"/>
-                <w:b w:val="false"/>
-                <w:u w:val="none"/>
-                <w:strike w:val="false"/>
-                <w:sz w:val="24"/>
-                <w:szCs w:val="24"/>
-                <w:color w:val="000000"/>
-              </w:rPr>
-            </w:pPr>
-            <w:r>
-              <w:rPr>
-                <w:rFonts w:ascii="Times New Roman" w:hAnsi="Arial" w:eastAsia="Arial" w:cs="Arial"/>
-                <w:i w:val="false"/>
-                <w:b w:val="false"/>
-                <w:u w:val="none"/>
-                <w:strike w:val="false"/>
-                <w:sz w:val="24"/>
-                <w:szCs w:val="24"/>
-                <w:color w:val="000000"/>
-              </w:rPr>
-              <w:t xml:space="preserve">0.12</w:t>
+              <w:jc w:val="left"/>
+              <w:pBdr>
+                <w:bottom w:val="none" w:sz="0" w:space="0" w:color="000000"/>
+                <w:top w:val="none" w:sz="0" w:space="0" w:color="000000"/>
+                <w:left w:val="none" w:sz="0" w:space="0" w:color="000000"/>
+                <w:right w:val="none" w:sz="0" w:space="0" w:color="000000"/>
+              </w:pBdr>
+              <w:spacing w:after="100" w:before="100" w:line="240"/>
+              <w:ind w:left="100" w:right="100" w:firstLine="0" w:firstLineChars="0"/>
+              <w:rPr>
+                <w:rFonts w:ascii="Times New Roman" w:hAnsi="Arial" w:eastAsia="Arial" w:cs="Arial"/>
+                <w:i w:val="false"/>
+                <w:b w:val="false"/>
+                <w:u w:val="none"/>
+                <w:strike w:val="false"/>
+                <w:sz w:val="24"/>
+                <w:szCs w:val="24"/>
+                <w:color w:val="000000"/>
+              </w:rPr>
+            </w:pPr>
+            <w:r>
+              <w:rPr>
+                <w:rFonts w:ascii="Times New Roman" w:hAnsi="Arial" w:eastAsia="Arial" w:cs="Arial"/>
+                <w:i w:val="false"/>
+                <w:b w:val="false"/>
+                <w:u w:val="none"/>
+                <w:strike w:val="false"/>
+                <w:sz w:val="24"/>
+                <w:szCs w:val="24"/>
+                <w:color w:val="000000"/>
+              </w:rPr>
+              <w:t xml:space="preserve">100%</w:t>
             </w:r>
           </w:p>
         </w:tc>
@@ -3291,38 +2391,38 @@
           <w:p>
             <w:pPr>
               <w:pStyle w:val="Normal"/>
-              <w:jc w:val="right"/>
-              <w:pBdr>
-                <w:bottom w:val="none" w:sz="0" w:space="0" w:color="000000"/>
-                <w:top w:val="none" w:sz="0" w:space="0" w:color="000000"/>
-                <w:left w:val="none" w:sz="0" w:space="0" w:color="000000"/>
-                <w:right w:val="none" w:sz="0" w:space="0" w:color="000000"/>
-              </w:pBdr>
-              <w:spacing w:after="100" w:before="100" w:line="240"/>
-              <w:ind w:left="100" w:right="100" w:firstLine="0" w:firstLineChars="0"/>
-              <w:rPr>
-                <w:rFonts w:ascii="Times New Roman" w:hAnsi="Arial" w:eastAsia="Arial" w:cs="Arial"/>
-                <w:i w:val="false"/>
-                <w:b w:val="false"/>
-                <w:u w:val="none"/>
-                <w:strike w:val="false"/>
-                <w:sz w:val="24"/>
-                <w:szCs w:val="24"/>
-                <w:color w:val="000000"/>
-              </w:rPr>
-            </w:pPr>
-            <w:r>
-              <w:rPr>
-                <w:rFonts w:ascii="Times New Roman" w:hAnsi="Arial" w:eastAsia="Arial" w:cs="Arial"/>
-                <w:i w:val="false"/>
-                <w:b w:val="false"/>
-                <w:u w:val="none"/>
-                <w:strike w:val="false"/>
-                <w:sz w:val="24"/>
-                <w:szCs w:val="24"/>
-                <w:color w:val="000000"/>
-              </w:rPr>
-              <w:t xml:space="preserve">47.62</w:t>
+              <w:jc w:val="left"/>
+              <w:pBdr>
+                <w:bottom w:val="none" w:sz="0" w:space="0" w:color="000000"/>
+                <w:top w:val="none" w:sz="0" w:space="0" w:color="000000"/>
+                <w:left w:val="none" w:sz="0" w:space="0" w:color="000000"/>
+                <w:right w:val="none" w:sz="0" w:space="0" w:color="000000"/>
+              </w:pBdr>
+              <w:spacing w:after="100" w:before="100" w:line="240"/>
+              <w:ind w:left="100" w:right="100" w:firstLine="0" w:firstLineChars="0"/>
+              <w:rPr>
+                <w:rFonts w:ascii="Times New Roman" w:hAnsi="Arial" w:eastAsia="Arial" w:cs="Arial"/>
+                <w:i w:val="false"/>
+                <w:b w:val="false"/>
+                <w:u w:val="none"/>
+                <w:strike w:val="false"/>
+                <w:sz w:val="24"/>
+                <w:szCs w:val="24"/>
+                <w:color w:val="000000"/>
+              </w:rPr>
+            </w:pPr>
+            <w:r>
+              <w:rPr>
+                <w:rFonts w:ascii="Times New Roman" w:hAnsi="Arial" w:eastAsia="Arial" w:cs="Arial"/>
+                <w:i w:val="false"/>
+                <w:b w:val="false"/>
+                <w:u w:val="none"/>
+                <w:strike w:val="false"/>
+                <w:sz w:val="24"/>
+                <w:szCs w:val="24"/>
+                <w:color w:val="000000"/>
+              </w:rPr>
+              <w:t xml:space="preserve">1061.4%</w:t>
             </w:r>
           </w:p>
         </w:tc>

</xml_diff>

<commit_message>
Use 'primary' and 'hospital admitted patient care' instead of SNOMED CT and ICD-10
</commit_message>
<xml_diff>
--- a/output/tables/descriptive_tables.docx
+++ b/output/tables/descriptive_tables.docx
@@ -322,7 +322,7 @@
                 <w:szCs w:val="24"/>
                 <w:color w:val="000000"/>
               </w:rPr>
-              <w:t xml:space="preserve">SNOMED CT Codes (2011-2025)</w:t>
+              <w:t xml:space="preserve">Codes used in primary care (2011-2025)</w:t>
             </w:r>
           </w:p>
         </w:tc>
@@ -492,7 +492,7 @@
                 <w:szCs w:val="24"/>
                 <w:color w:val="000000"/>
               </w:rPr>
-              <w:t xml:space="preserve">N/A</w:t>
+              <w:t xml:space="preserve">1472974.64%</w:t>
             </w:r>
           </w:p>
         </w:tc>
@@ -607,7 +607,7 @@
                 <w:szCs w:val="24"/>
                 <w:color w:val="000000"/>
               </w:rPr>
-              <w:t xml:space="preserve">All ADHD diagnosis-related SNOMED CT codes</w:t>
+              <w:t xml:space="preserve">All ADHD diagnosis-related primary care codes</w:t>
             </w:r>
           </w:p>
         </w:tc>
@@ -1972,7 +1972,7 @@
                 <w:szCs w:val="24"/>
                 <w:color w:val="000000"/>
               </w:rPr>
-              <w:t xml:space="preserve">ICD-10 Codes (2012-2025)</w:t>
+              <w:t xml:space="preserve">Codes used in hospital admitted patient care (2012-2025)</w:t>
             </w:r>
           </w:p>
         </w:tc>
@@ -2142,7 +2142,7 @@
                 <w:szCs w:val="24"/>
                 <w:color w:val="000000"/>
               </w:rPr>
-              <w:t xml:space="preserve">N/A</w:t>
+              <w:t xml:space="preserve">278093.94%</w:t>
             </w:r>
           </w:p>
         </w:tc>

</xml_diff>

<commit_message>
Make chunks render and clean up diagnosis coding results
</commit_message>
<xml_diff>
--- a/output/tables/descriptive_tables.docx
+++ b/output/tables/descriptive_tables.docx
@@ -75,19 +75,19 @@
               <w:spacing w:after="100" w:before="100" w:line="240"/>
               <w:ind w:left="100" w:right="100" w:firstLine="0" w:firstLineChars="0"/>
               <w:rPr>
-                <w:rFonts w:ascii="Times New Roman" w:hAnsi="Arial" w:eastAsia="Arial" w:cs="Arial"/>
-                <w:i w:val="false"/>
-                <w:b w:val="false"/>
-                <w:u w:val="none"/>
-                <w:strike w:val="false"/>
-                <w:sz w:val="24"/>
-                <w:szCs w:val="24"/>
-                <w:color w:val="000000"/>
-              </w:rPr>
-            </w:pPr>
-            <w:r>
-              <w:rPr>
-                <w:rFonts w:ascii="Times New Roman" w:hAnsi="Arial" w:eastAsia="Arial" w:cs="Arial"/>
+                <w:rFonts w:ascii="Times New Roman" w:hAnsi="Helvetica" w:eastAsia="Helvetica" w:cs="Helvetica"/>
+                <w:i w:val="false"/>
+                <w:b w:val="false"/>
+                <w:u w:val="none"/>
+                <w:strike w:val="false"/>
+                <w:sz w:val="24"/>
+                <w:szCs w:val="24"/>
+                <w:color w:val="000000"/>
+              </w:rPr>
+            </w:pPr>
+            <w:r>
+              <w:rPr>
+                <w:rFonts w:ascii="Times New Roman" w:hAnsi="Helvetica" w:eastAsia="Helvetica" w:cs="Helvetica"/>
                 <w:i w:val="false"/>
                 <w:b w:val="false"/>
                 <w:u w:val="none"/>
@@ -130,19 +130,19 @@
               <w:spacing w:after="100" w:before="100" w:line="240"/>
               <w:ind w:left="100" w:right="100" w:firstLine="0" w:firstLineChars="0"/>
               <w:rPr>
-                <w:rFonts w:ascii="Times New Roman" w:hAnsi="Arial" w:eastAsia="Arial" w:cs="Arial"/>
-                <w:i w:val="false"/>
-                <w:b w:val="false"/>
-                <w:u w:val="none"/>
-                <w:strike w:val="false"/>
-                <w:sz w:val="24"/>
-                <w:szCs w:val="24"/>
-                <w:color w:val="000000"/>
-              </w:rPr>
-            </w:pPr>
-            <w:r>
-              <w:rPr>
-                <w:rFonts w:ascii="Times New Roman" w:hAnsi="Arial" w:eastAsia="Arial" w:cs="Arial"/>
+                <w:rFonts w:ascii="Times New Roman" w:hAnsi="Helvetica" w:eastAsia="Helvetica" w:cs="Helvetica"/>
+                <w:i w:val="false"/>
+                <w:b w:val="false"/>
+                <w:u w:val="none"/>
+                <w:strike w:val="false"/>
+                <w:sz w:val="24"/>
+                <w:szCs w:val="24"/>
+                <w:color w:val="000000"/>
+              </w:rPr>
+            </w:pPr>
+            <w:r>
+              <w:rPr>
+                <w:rFonts w:ascii="Times New Roman" w:hAnsi="Helvetica" w:eastAsia="Helvetica" w:cs="Helvetica"/>
                 <w:i w:val="false"/>
                 <w:b w:val="false"/>
                 <w:u w:val="none"/>
@@ -185,19 +185,19 @@
               <w:spacing w:after="100" w:before="100" w:line="240"/>
               <w:ind w:left="100" w:right="100" w:firstLine="0" w:firstLineChars="0"/>
               <w:rPr>
-                <w:rFonts w:ascii="Times New Roman" w:hAnsi="Arial" w:eastAsia="Arial" w:cs="Arial"/>
-                <w:i w:val="false"/>
-                <w:b w:val="false"/>
-                <w:u w:val="none"/>
-                <w:strike w:val="false"/>
-                <w:sz w:val="24"/>
-                <w:szCs w:val="24"/>
-                <w:color w:val="000000"/>
-              </w:rPr>
-            </w:pPr>
-            <w:r>
-              <w:rPr>
-                <w:rFonts w:ascii="Times New Roman" w:hAnsi="Arial" w:eastAsia="Arial" w:cs="Arial"/>
+                <w:rFonts w:ascii="Times New Roman" w:hAnsi="Helvetica" w:eastAsia="Helvetica" w:cs="Helvetica"/>
+                <w:i w:val="false"/>
+                <w:b w:val="false"/>
+                <w:u w:val="none"/>
+                <w:strike w:val="false"/>
+                <w:sz w:val="24"/>
+                <w:szCs w:val="24"/>
+                <w:color w:val="000000"/>
+              </w:rPr>
+            </w:pPr>
+            <w:r>
+              <w:rPr>
+                <w:rFonts w:ascii="Times New Roman" w:hAnsi="Helvetica" w:eastAsia="Helvetica" w:cs="Helvetica"/>
                 <w:i w:val="false"/>
                 <w:b w:val="false"/>
                 <w:u w:val="none"/>
@@ -240,19 +240,19 @@
               <w:spacing w:after="100" w:before="100" w:line="240"/>
               <w:ind w:left="100" w:right="100" w:firstLine="0" w:firstLineChars="0"/>
               <w:rPr>
-                <w:rFonts w:ascii="Times New Roman" w:hAnsi="Arial" w:eastAsia="Arial" w:cs="Arial"/>
-                <w:i w:val="false"/>
-                <w:b w:val="false"/>
-                <w:u w:val="none"/>
-                <w:strike w:val="false"/>
-                <w:sz w:val="24"/>
-                <w:szCs w:val="24"/>
-                <w:color w:val="000000"/>
-              </w:rPr>
-            </w:pPr>
-            <w:r>
-              <w:rPr>
-                <w:rFonts w:ascii="Times New Roman" w:hAnsi="Arial" w:eastAsia="Arial" w:cs="Arial"/>
+                <w:rFonts w:ascii="Times New Roman" w:hAnsi="Helvetica" w:eastAsia="Helvetica" w:cs="Helvetica"/>
+                <w:i w:val="false"/>
+                <w:b w:val="false"/>
+                <w:u w:val="none"/>
+                <w:strike w:val="false"/>
+                <w:sz w:val="24"/>
+                <w:szCs w:val="24"/>
+                <w:color w:val="000000"/>
+              </w:rPr>
+            </w:pPr>
+            <w:r>
+              <w:rPr>
+                <w:rFonts w:ascii="Times New Roman" w:hAnsi="Helvetica" w:eastAsia="Helvetica" w:cs="Helvetica"/>
                 <w:i w:val="false"/>
                 <w:b w:val="false"/>
                 <w:u w:val="none"/>
@@ -301,7 +301,7 @@
               <w:spacing w:after="100" w:before="100" w:line="240"/>
               <w:ind w:left="100" w:right="100" w:firstLine="0" w:firstLineChars="0"/>
               <w:rPr>
-                <w:rFonts w:ascii="Times New Roman" w:hAnsi="Arial" w:eastAsia="Arial" w:cs="Arial"/>
+                <w:rFonts w:ascii="Times New Roman" w:hAnsi="Helvetica" w:eastAsia="Helvetica" w:cs="Helvetica"/>
                 <w:i w:val="false"/>
                 <w:b w:val="true"/>
                 <w:u w:val="none"/>
@@ -313,7 +313,7 @@
             </w:pPr>
             <w:r>
               <w:rPr>
-                <w:rFonts w:ascii="Times New Roman" w:hAnsi="Arial" w:eastAsia="Arial" w:cs="Arial"/>
+                <w:rFonts w:ascii="Times New Roman" w:hAnsi="Helvetica" w:eastAsia="Helvetica" w:cs="Helvetica"/>
                 <w:i w:val="false"/>
                 <w:b w:val="true"/>
                 <w:u w:val="none"/>
@@ -361,19 +361,19 @@
               <w:spacing w:after="100" w:before="100" w:line="240"/>
               <w:ind w:left="100" w:right="100" w:firstLine="0" w:firstLineChars="0"/>
               <w:rPr>
-                <w:rFonts w:ascii="Times New Roman" w:hAnsi="Arial" w:eastAsia="Arial" w:cs="Arial"/>
-                <w:i w:val="false"/>
-                <w:b w:val="false"/>
-                <w:u w:val="none"/>
-                <w:strike w:val="false"/>
-                <w:sz w:val="24"/>
-                <w:szCs w:val="24"/>
-                <w:color w:val="000000"/>
-              </w:rPr>
-            </w:pPr>
-            <w:r>
-              <w:rPr>
-                <w:rFonts w:ascii="Times New Roman" w:hAnsi="Arial" w:eastAsia="Arial" w:cs="Arial"/>
+                <w:rFonts w:ascii="Times New Roman" w:hAnsi="Helvetica" w:eastAsia="Helvetica" w:cs="Helvetica"/>
+                <w:i w:val="false"/>
+                <w:b w:val="false"/>
+                <w:u w:val="none"/>
+                <w:strike w:val="false"/>
+                <w:sz w:val="24"/>
+                <w:szCs w:val="24"/>
+                <w:color w:val="000000"/>
+              </w:rPr>
+            </w:pPr>
+            <w:r>
+              <w:rPr>
+                <w:rFonts w:ascii="Times New Roman" w:hAnsi="Helvetica" w:eastAsia="Helvetica" w:cs="Helvetica"/>
                 <w:i w:val="false"/>
                 <w:b w:val="false"/>
                 <w:u w:val="none"/>
@@ -416,19 +416,19 @@
               <w:spacing w:after="100" w:before="100" w:line="240"/>
               <w:ind w:left="100" w:right="100" w:firstLine="0" w:firstLineChars="0"/>
               <w:rPr>
-                <w:rFonts w:ascii="Times New Roman" w:hAnsi="Arial" w:eastAsia="Arial" w:cs="Arial"/>
-                <w:i w:val="false"/>
-                <w:b w:val="false"/>
-                <w:u w:val="none"/>
-                <w:strike w:val="false"/>
-                <w:sz w:val="24"/>
-                <w:szCs w:val="24"/>
-                <w:color w:val="000000"/>
-              </w:rPr>
-            </w:pPr>
-            <w:r>
-              <w:rPr>
-                <w:rFonts w:ascii="Times New Roman" w:hAnsi="Arial" w:eastAsia="Arial" w:cs="Arial"/>
+                <w:rFonts w:ascii="Times New Roman" w:hAnsi="Helvetica" w:eastAsia="Helvetica" w:cs="Helvetica"/>
+                <w:i w:val="false"/>
+                <w:b w:val="false"/>
+                <w:u w:val="none"/>
+                <w:strike w:val="false"/>
+                <w:sz w:val="24"/>
+                <w:szCs w:val="24"/>
+                <w:color w:val="000000"/>
+              </w:rPr>
+            </w:pPr>
+            <w:r>
+              <w:rPr>
+                <w:rFonts w:ascii="Times New Roman" w:hAnsi="Helvetica" w:eastAsia="Helvetica" w:cs="Helvetica"/>
                 <w:i w:val="false"/>
                 <w:b w:val="false"/>
                 <w:u w:val="none"/>
@@ -471,19 +471,19 @@
               <w:spacing w:after="100" w:before="100" w:line="240"/>
               <w:ind w:left="100" w:right="100" w:firstLine="0" w:firstLineChars="0"/>
               <w:rPr>
-                <w:rFonts w:ascii="Times New Roman" w:hAnsi="Arial" w:eastAsia="Arial" w:cs="Arial"/>
-                <w:i w:val="false"/>
-                <w:b w:val="false"/>
-                <w:u w:val="none"/>
-                <w:strike w:val="false"/>
-                <w:sz w:val="24"/>
-                <w:szCs w:val="24"/>
-                <w:color w:val="000000"/>
-              </w:rPr>
-            </w:pPr>
-            <w:r>
-              <w:rPr>
-                <w:rFonts w:ascii="Times New Roman" w:hAnsi="Arial" w:eastAsia="Arial" w:cs="Arial"/>
+                <w:rFonts w:ascii="Times New Roman" w:hAnsi="Helvetica" w:eastAsia="Helvetica" w:cs="Helvetica"/>
+                <w:i w:val="false"/>
+                <w:b w:val="false"/>
+                <w:u w:val="none"/>
+                <w:strike w:val="false"/>
+                <w:sz w:val="24"/>
+                <w:szCs w:val="24"/>
+                <w:color w:val="000000"/>
+              </w:rPr>
+            </w:pPr>
+            <w:r>
+              <w:rPr>
+                <w:rFonts w:ascii="Times New Roman" w:hAnsi="Helvetica" w:eastAsia="Helvetica" w:cs="Helvetica"/>
                 <w:i w:val="false"/>
                 <w:b w:val="false"/>
                 <w:u w:val="none"/>
@@ -526,19 +526,19 @@
               <w:spacing w:after="100" w:before="100" w:line="240"/>
               <w:ind w:left="100" w:right="100" w:firstLine="0" w:firstLineChars="0"/>
               <w:rPr>
-                <w:rFonts w:ascii="Times New Roman" w:hAnsi="Arial" w:eastAsia="Arial" w:cs="Arial"/>
-                <w:i w:val="false"/>
-                <w:b w:val="false"/>
-                <w:u w:val="none"/>
-                <w:strike w:val="false"/>
-                <w:sz w:val="24"/>
-                <w:szCs w:val="24"/>
-                <w:color w:val="000000"/>
-              </w:rPr>
-            </w:pPr>
-            <w:r>
-              <w:rPr>
-                <w:rFonts w:ascii="Times New Roman" w:hAnsi="Arial" w:eastAsia="Arial" w:cs="Arial"/>
+                <w:rFonts w:ascii="Times New Roman" w:hAnsi="Helvetica" w:eastAsia="Helvetica" w:cs="Helvetica"/>
+                <w:i w:val="false"/>
+                <w:b w:val="false"/>
+                <w:u w:val="none"/>
+                <w:strike w:val="false"/>
+                <w:sz w:val="24"/>
+                <w:szCs w:val="24"/>
+                <w:color w:val="000000"/>
+              </w:rPr>
+            </w:pPr>
+            <w:r>
+              <w:rPr>
+                <w:rFonts w:ascii="Times New Roman" w:hAnsi="Helvetica" w:eastAsia="Helvetica" w:cs="Helvetica"/>
                 <w:i w:val="false"/>
                 <w:b w:val="false"/>
                 <w:u w:val="none"/>
@@ -586,19 +586,19 @@
               <w:spacing w:after="100" w:before="100" w:line="240"/>
               <w:ind w:left="100" w:right="100" w:firstLine="0" w:firstLineChars="0"/>
               <w:rPr>
-                <w:rFonts w:ascii="Times New Roman" w:hAnsi="Arial" w:eastAsia="Arial" w:cs="Arial"/>
-                <w:i w:val="false"/>
-                <w:b w:val="false"/>
-                <w:u w:val="none"/>
-                <w:strike w:val="false"/>
-                <w:sz w:val="24"/>
-                <w:szCs w:val="24"/>
-                <w:color w:val="000000"/>
-              </w:rPr>
-            </w:pPr>
-            <w:r>
-              <w:rPr>
-                <w:rFonts w:ascii="Times New Roman" w:hAnsi="Arial" w:eastAsia="Arial" w:cs="Arial"/>
+                <w:rFonts w:ascii="Times New Roman" w:hAnsi="Helvetica" w:eastAsia="Helvetica" w:cs="Helvetica"/>
+                <w:i w:val="false"/>
+                <w:b w:val="false"/>
+                <w:u w:val="none"/>
+                <w:strike w:val="false"/>
+                <w:sz w:val="24"/>
+                <w:szCs w:val="24"/>
+                <w:color w:val="000000"/>
+              </w:rPr>
+            </w:pPr>
+            <w:r>
+              <w:rPr>
+                <w:rFonts w:ascii="Times New Roman" w:hAnsi="Helvetica" w:eastAsia="Helvetica" w:cs="Helvetica"/>
                 <w:i w:val="false"/>
                 <w:b w:val="false"/>
                 <w:u w:val="none"/>
@@ -641,19 +641,19 @@
               <w:spacing w:after="100" w:before="100" w:line="240"/>
               <w:ind w:left="100" w:right="100" w:firstLine="0" w:firstLineChars="0"/>
               <w:rPr>
-                <w:rFonts w:ascii="Times New Roman" w:hAnsi="Arial" w:eastAsia="Arial" w:cs="Arial"/>
-                <w:i w:val="false"/>
-                <w:b w:val="false"/>
-                <w:u w:val="none"/>
-                <w:strike w:val="false"/>
-                <w:sz w:val="24"/>
-                <w:szCs w:val="24"/>
-                <w:color w:val="000000"/>
-              </w:rPr>
-            </w:pPr>
-            <w:r>
-              <w:rPr>
-                <w:rFonts w:ascii="Times New Roman" w:hAnsi="Arial" w:eastAsia="Arial" w:cs="Arial"/>
+                <w:rFonts w:ascii="Times New Roman" w:hAnsi="Helvetica" w:eastAsia="Helvetica" w:cs="Helvetica"/>
+                <w:i w:val="false"/>
+                <w:b w:val="false"/>
+                <w:u w:val="none"/>
+                <w:strike w:val="false"/>
+                <w:sz w:val="24"/>
+                <w:szCs w:val="24"/>
+                <w:color w:val="000000"/>
+              </w:rPr>
+            </w:pPr>
+            <w:r>
+              <w:rPr>
+                <w:rFonts w:ascii="Times New Roman" w:hAnsi="Helvetica" w:eastAsia="Helvetica" w:cs="Helvetica"/>
                 <w:i w:val="false"/>
                 <w:b w:val="false"/>
                 <w:u w:val="none"/>
@@ -696,19 +696,19 @@
               <w:spacing w:after="100" w:before="100" w:line="240"/>
               <w:ind w:left="100" w:right="100" w:firstLine="0" w:firstLineChars="0"/>
               <w:rPr>
-                <w:rFonts w:ascii="Times New Roman" w:hAnsi="Arial" w:eastAsia="Arial" w:cs="Arial"/>
-                <w:i w:val="false"/>
-                <w:b w:val="false"/>
-                <w:u w:val="none"/>
-                <w:strike w:val="false"/>
-                <w:sz w:val="24"/>
-                <w:szCs w:val="24"/>
-                <w:color w:val="000000"/>
-              </w:rPr>
-            </w:pPr>
-            <w:r>
-              <w:rPr>
-                <w:rFonts w:ascii="Times New Roman" w:hAnsi="Arial" w:eastAsia="Arial" w:cs="Arial"/>
+                <w:rFonts w:ascii="Times New Roman" w:hAnsi="Helvetica" w:eastAsia="Helvetica" w:cs="Helvetica"/>
+                <w:i w:val="false"/>
+                <w:b w:val="false"/>
+                <w:u w:val="none"/>
+                <w:strike w:val="false"/>
+                <w:sz w:val="24"/>
+                <w:szCs w:val="24"/>
+                <w:color w:val="000000"/>
+              </w:rPr>
+            </w:pPr>
+            <w:r>
+              <w:rPr>
+                <w:rFonts w:ascii="Times New Roman" w:hAnsi="Helvetica" w:eastAsia="Helvetica" w:cs="Helvetica"/>
                 <w:i w:val="false"/>
                 <w:b w:val="false"/>
                 <w:u w:val="none"/>
@@ -751,19 +751,19 @@
               <w:spacing w:after="100" w:before="100" w:line="240"/>
               <w:ind w:left="100" w:right="100" w:firstLine="0" w:firstLineChars="0"/>
               <w:rPr>
-                <w:rFonts w:ascii="Times New Roman" w:hAnsi="Arial" w:eastAsia="Arial" w:cs="Arial"/>
-                <w:i w:val="false"/>
-                <w:b w:val="false"/>
-                <w:u w:val="none"/>
-                <w:strike w:val="false"/>
-                <w:sz w:val="24"/>
-                <w:szCs w:val="24"/>
-                <w:color w:val="000000"/>
-              </w:rPr>
-            </w:pPr>
-            <w:r>
-              <w:rPr>
-                <w:rFonts w:ascii="Times New Roman" w:hAnsi="Arial" w:eastAsia="Arial" w:cs="Arial"/>
+                <w:rFonts w:ascii="Times New Roman" w:hAnsi="Helvetica" w:eastAsia="Helvetica" w:cs="Helvetica"/>
+                <w:i w:val="false"/>
+                <w:b w:val="false"/>
+                <w:u w:val="none"/>
+                <w:strike w:val="false"/>
+                <w:sz w:val="24"/>
+                <w:szCs w:val="24"/>
+                <w:color w:val="000000"/>
+              </w:rPr>
+            </w:pPr>
+            <w:r>
+              <w:rPr>
+                <w:rFonts w:ascii="Times New Roman" w:hAnsi="Helvetica" w:eastAsia="Helvetica" w:cs="Helvetica"/>
                 <w:i w:val="false"/>
                 <w:b w:val="false"/>
                 <w:u w:val="none"/>
@@ -811,19 +811,19 @@
               <w:spacing w:after="100" w:before="100" w:line="240"/>
               <w:ind w:left="100" w:right="100" w:firstLine="0" w:firstLineChars="0"/>
               <w:rPr>
-                <w:rFonts w:ascii="Times New Roman" w:hAnsi="Arial" w:eastAsia="Arial" w:cs="Arial"/>
-                <w:i w:val="false"/>
-                <w:b w:val="false"/>
-                <w:u w:val="none"/>
-                <w:strike w:val="false"/>
-                <w:sz w:val="24"/>
-                <w:szCs w:val="24"/>
-                <w:color w:val="000000"/>
-              </w:rPr>
-            </w:pPr>
-            <w:r>
-              <w:rPr>
-                <w:rFonts w:ascii="Times New Roman" w:hAnsi="Arial" w:eastAsia="Arial" w:cs="Arial"/>
+                <w:rFonts w:ascii="Times New Roman" w:hAnsi="Helvetica" w:eastAsia="Helvetica" w:cs="Helvetica"/>
+                <w:i w:val="false"/>
+                <w:b w:val="false"/>
+                <w:u w:val="none"/>
+                <w:strike w:val="false"/>
+                <w:sz w:val="24"/>
+                <w:szCs w:val="24"/>
+                <w:color w:val="000000"/>
+              </w:rPr>
+            </w:pPr>
+            <w:r>
+              <w:rPr>
+                <w:rFonts w:ascii="Times New Roman" w:hAnsi="Helvetica" w:eastAsia="Helvetica" w:cs="Helvetica"/>
                 <w:i w:val="false"/>
                 <w:b w:val="false"/>
                 <w:u w:val="none"/>
@@ -866,19 +866,19 @@
               <w:spacing w:after="100" w:before="100" w:line="240"/>
               <w:ind w:left="100" w:right="100" w:firstLine="0" w:firstLineChars="0"/>
               <w:rPr>
-                <w:rFonts w:ascii="Times New Roman" w:hAnsi="Arial" w:eastAsia="Arial" w:cs="Arial"/>
-                <w:i w:val="false"/>
-                <w:b w:val="false"/>
-                <w:u w:val="none"/>
-                <w:strike w:val="false"/>
-                <w:sz w:val="24"/>
-                <w:szCs w:val="24"/>
-                <w:color w:val="000000"/>
-              </w:rPr>
-            </w:pPr>
-            <w:r>
-              <w:rPr>
-                <w:rFonts w:ascii="Times New Roman" w:hAnsi="Arial" w:eastAsia="Arial" w:cs="Arial"/>
+                <w:rFonts w:ascii="Times New Roman" w:hAnsi="Helvetica" w:eastAsia="Helvetica" w:cs="Helvetica"/>
+                <w:i w:val="false"/>
+                <w:b w:val="false"/>
+                <w:u w:val="none"/>
+                <w:strike w:val="false"/>
+                <w:sz w:val="24"/>
+                <w:szCs w:val="24"/>
+                <w:color w:val="000000"/>
+              </w:rPr>
+            </w:pPr>
+            <w:r>
+              <w:rPr>
+                <w:rFonts w:ascii="Times New Roman" w:hAnsi="Helvetica" w:eastAsia="Helvetica" w:cs="Helvetica"/>
                 <w:i w:val="false"/>
                 <w:b w:val="false"/>
                 <w:u w:val="none"/>
@@ -921,19 +921,19 @@
               <w:spacing w:after="100" w:before="100" w:line="240"/>
               <w:ind w:left="100" w:right="100" w:firstLine="0" w:firstLineChars="0"/>
               <w:rPr>
-                <w:rFonts w:ascii="Times New Roman" w:hAnsi="Arial" w:eastAsia="Arial" w:cs="Arial"/>
-                <w:i w:val="false"/>
-                <w:b w:val="false"/>
-                <w:u w:val="none"/>
-                <w:strike w:val="false"/>
-                <w:sz w:val="24"/>
-                <w:szCs w:val="24"/>
-                <w:color w:val="000000"/>
-              </w:rPr>
-            </w:pPr>
-            <w:r>
-              <w:rPr>
-                <w:rFonts w:ascii="Times New Roman" w:hAnsi="Arial" w:eastAsia="Arial" w:cs="Arial"/>
+                <w:rFonts w:ascii="Times New Roman" w:hAnsi="Helvetica" w:eastAsia="Helvetica" w:cs="Helvetica"/>
+                <w:i w:val="false"/>
+                <w:b w:val="false"/>
+                <w:u w:val="none"/>
+                <w:strike w:val="false"/>
+                <w:sz w:val="24"/>
+                <w:szCs w:val="24"/>
+                <w:color w:val="000000"/>
+              </w:rPr>
+            </w:pPr>
+            <w:r>
+              <w:rPr>
+                <w:rFonts w:ascii="Times New Roman" w:hAnsi="Helvetica" w:eastAsia="Helvetica" w:cs="Helvetica"/>
                 <w:i w:val="false"/>
                 <w:b w:val="false"/>
                 <w:u w:val="none"/>
@@ -976,19 +976,19 @@
               <w:spacing w:after="100" w:before="100" w:line="240"/>
               <w:ind w:left="100" w:right="100" w:firstLine="0" w:firstLineChars="0"/>
               <w:rPr>
-                <w:rFonts w:ascii="Times New Roman" w:hAnsi="Arial" w:eastAsia="Arial" w:cs="Arial"/>
-                <w:i w:val="false"/>
-                <w:b w:val="false"/>
-                <w:u w:val="none"/>
-                <w:strike w:val="false"/>
-                <w:sz w:val="24"/>
-                <w:szCs w:val="24"/>
-                <w:color w:val="000000"/>
-              </w:rPr>
-            </w:pPr>
-            <w:r>
-              <w:rPr>
-                <w:rFonts w:ascii="Times New Roman" w:hAnsi="Arial" w:eastAsia="Arial" w:cs="Arial"/>
+                <w:rFonts w:ascii="Times New Roman" w:hAnsi="Helvetica" w:eastAsia="Helvetica" w:cs="Helvetica"/>
+                <w:i w:val="false"/>
+                <w:b w:val="false"/>
+                <w:u w:val="none"/>
+                <w:strike w:val="false"/>
+                <w:sz w:val="24"/>
+                <w:szCs w:val="24"/>
+                <w:color w:val="000000"/>
+              </w:rPr>
+            </w:pPr>
+            <w:r>
+              <w:rPr>
+                <w:rFonts w:ascii="Times New Roman" w:hAnsi="Helvetica" w:eastAsia="Helvetica" w:cs="Helvetica"/>
                 <w:i w:val="false"/>
                 <w:b w:val="false"/>
                 <w:u w:val="none"/>
@@ -1036,19 +1036,19 @@
               <w:spacing w:after="100" w:before="100" w:line="240"/>
               <w:ind w:left="100" w:right="100" w:firstLine="0" w:firstLineChars="0"/>
               <w:rPr>
-                <w:rFonts w:ascii="Times New Roman" w:hAnsi="Arial" w:eastAsia="Arial" w:cs="Arial"/>
-                <w:i w:val="false"/>
-                <w:b w:val="false"/>
-                <w:u w:val="none"/>
-                <w:strike w:val="false"/>
-                <w:sz w:val="24"/>
-                <w:szCs w:val="24"/>
-                <w:color w:val="000000"/>
-              </w:rPr>
-            </w:pPr>
-            <w:r>
-              <w:rPr>
-                <w:rFonts w:ascii="Times New Roman" w:hAnsi="Arial" w:eastAsia="Arial" w:cs="Arial"/>
+                <w:rFonts w:ascii="Times New Roman" w:hAnsi="Helvetica" w:eastAsia="Helvetica" w:cs="Helvetica"/>
+                <w:i w:val="false"/>
+                <w:b w:val="false"/>
+                <w:u w:val="none"/>
+                <w:strike w:val="false"/>
+                <w:sz w:val="24"/>
+                <w:szCs w:val="24"/>
+                <w:color w:val="000000"/>
+              </w:rPr>
+            </w:pPr>
+            <w:r>
+              <w:rPr>
+                <w:rFonts w:ascii="Times New Roman" w:hAnsi="Helvetica" w:eastAsia="Helvetica" w:cs="Helvetica"/>
                 <w:i w:val="false"/>
                 <w:b w:val="false"/>
                 <w:u w:val="none"/>
@@ -1091,19 +1091,19 @@
               <w:spacing w:after="100" w:before="100" w:line="240"/>
               <w:ind w:left="100" w:right="100" w:firstLine="0" w:firstLineChars="0"/>
               <w:rPr>
-                <w:rFonts w:ascii="Times New Roman" w:hAnsi="Arial" w:eastAsia="Arial" w:cs="Arial"/>
-                <w:i w:val="false"/>
-                <w:b w:val="false"/>
-                <w:u w:val="none"/>
-                <w:strike w:val="false"/>
-                <w:sz w:val="24"/>
-                <w:szCs w:val="24"/>
-                <w:color w:val="000000"/>
-              </w:rPr>
-            </w:pPr>
-            <w:r>
-              <w:rPr>
-                <w:rFonts w:ascii="Times New Roman" w:hAnsi="Arial" w:eastAsia="Arial" w:cs="Arial"/>
+                <w:rFonts w:ascii="Times New Roman" w:hAnsi="Helvetica" w:eastAsia="Helvetica" w:cs="Helvetica"/>
+                <w:i w:val="false"/>
+                <w:b w:val="false"/>
+                <w:u w:val="none"/>
+                <w:strike w:val="false"/>
+                <w:sz w:val="24"/>
+                <w:szCs w:val="24"/>
+                <w:color w:val="000000"/>
+              </w:rPr>
+            </w:pPr>
+            <w:r>
+              <w:rPr>
+                <w:rFonts w:ascii="Times New Roman" w:hAnsi="Helvetica" w:eastAsia="Helvetica" w:cs="Helvetica"/>
                 <w:i w:val="false"/>
                 <w:b w:val="false"/>
                 <w:u w:val="none"/>
@@ -1146,19 +1146,19 @@
               <w:spacing w:after="100" w:before="100" w:line="240"/>
               <w:ind w:left="100" w:right="100" w:firstLine="0" w:firstLineChars="0"/>
               <w:rPr>
-                <w:rFonts w:ascii="Times New Roman" w:hAnsi="Arial" w:eastAsia="Arial" w:cs="Arial"/>
-                <w:i w:val="false"/>
-                <w:b w:val="false"/>
-                <w:u w:val="none"/>
-                <w:strike w:val="false"/>
-                <w:sz w:val="24"/>
-                <w:szCs w:val="24"/>
-                <w:color w:val="000000"/>
-              </w:rPr>
-            </w:pPr>
-            <w:r>
-              <w:rPr>
-                <w:rFonts w:ascii="Times New Roman" w:hAnsi="Arial" w:eastAsia="Arial" w:cs="Arial"/>
+                <w:rFonts w:ascii="Times New Roman" w:hAnsi="Helvetica" w:eastAsia="Helvetica" w:cs="Helvetica"/>
+                <w:i w:val="false"/>
+                <w:b w:val="false"/>
+                <w:u w:val="none"/>
+                <w:strike w:val="false"/>
+                <w:sz w:val="24"/>
+                <w:szCs w:val="24"/>
+                <w:color w:val="000000"/>
+              </w:rPr>
+            </w:pPr>
+            <w:r>
+              <w:rPr>
+                <w:rFonts w:ascii="Times New Roman" w:hAnsi="Helvetica" w:eastAsia="Helvetica" w:cs="Helvetica"/>
                 <w:i w:val="false"/>
                 <w:b w:val="false"/>
                 <w:u w:val="none"/>
@@ -1201,19 +1201,19 @@
               <w:spacing w:after="100" w:before="100" w:line="240"/>
               <w:ind w:left="100" w:right="100" w:firstLine="0" w:firstLineChars="0"/>
               <w:rPr>
-                <w:rFonts w:ascii="Times New Roman" w:hAnsi="Arial" w:eastAsia="Arial" w:cs="Arial"/>
-                <w:i w:val="false"/>
-                <w:b w:val="false"/>
-                <w:u w:val="none"/>
-                <w:strike w:val="false"/>
-                <w:sz w:val="24"/>
-                <w:szCs w:val="24"/>
-                <w:color w:val="000000"/>
-              </w:rPr>
-            </w:pPr>
-            <w:r>
-              <w:rPr>
-                <w:rFonts w:ascii="Times New Roman" w:hAnsi="Arial" w:eastAsia="Arial" w:cs="Arial"/>
+                <w:rFonts w:ascii="Times New Roman" w:hAnsi="Helvetica" w:eastAsia="Helvetica" w:cs="Helvetica"/>
+                <w:i w:val="false"/>
+                <w:b w:val="false"/>
+                <w:u w:val="none"/>
+                <w:strike w:val="false"/>
+                <w:sz w:val="24"/>
+                <w:szCs w:val="24"/>
+                <w:color w:val="000000"/>
+              </w:rPr>
+            </w:pPr>
+            <w:r>
+              <w:rPr>
+                <w:rFonts w:ascii="Times New Roman" w:hAnsi="Helvetica" w:eastAsia="Helvetica" w:cs="Helvetica"/>
                 <w:i w:val="false"/>
                 <w:b w:val="false"/>
                 <w:u w:val="none"/>
@@ -1261,19 +1261,19 @@
               <w:spacing w:after="100" w:before="100" w:line="240"/>
               <w:ind w:left="100" w:right="100" w:firstLine="0" w:firstLineChars="0"/>
               <w:rPr>
-                <w:rFonts w:ascii="Times New Roman" w:hAnsi="Arial" w:eastAsia="Arial" w:cs="Arial"/>
-                <w:i w:val="false"/>
-                <w:b w:val="false"/>
-                <w:u w:val="none"/>
-                <w:strike w:val="false"/>
-                <w:sz w:val="24"/>
-                <w:szCs w:val="24"/>
-                <w:color w:val="000000"/>
-              </w:rPr>
-            </w:pPr>
-            <w:r>
-              <w:rPr>
-                <w:rFonts w:ascii="Times New Roman" w:hAnsi="Arial" w:eastAsia="Arial" w:cs="Arial"/>
+                <w:rFonts w:ascii="Times New Roman" w:hAnsi="Helvetica" w:eastAsia="Helvetica" w:cs="Helvetica"/>
+                <w:i w:val="false"/>
+                <w:b w:val="false"/>
+                <w:u w:val="none"/>
+                <w:strike w:val="false"/>
+                <w:sz w:val="24"/>
+                <w:szCs w:val="24"/>
+                <w:color w:val="000000"/>
+              </w:rPr>
+            </w:pPr>
+            <w:r>
+              <w:rPr>
+                <w:rFonts w:ascii="Times New Roman" w:hAnsi="Helvetica" w:eastAsia="Helvetica" w:cs="Helvetica"/>
                 <w:i w:val="false"/>
                 <w:b w:val="false"/>
                 <w:u w:val="none"/>
@@ -1316,19 +1316,19 @@
               <w:spacing w:after="100" w:before="100" w:line="240"/>
               <w:ind w:left="100" w:right="100" w:firstLine="0" w:firstLineChars="0"/>
               <w:rPr>
-                <w:rFonts w:ascii="Times New Roman" w:hAnsi="Arial" w:eastAsia="Arial" w:cs="Arial"/>
-                <w:i w:val="false"/>
-                <w:b w:val="false"/>
-                <w:u w:val="none"/>
-                <w:strike w:val="false"/>
-                <w:sz w:val="24"/>
-                <w:szCs w:val="24"/>
-                <w:color w:val="000000"/>
-              </w:rPr>
-            </w:pPr>
-            <w:r>
-              <w:rPr>
-                <w:rFonts w:ascii="Times New Roman" w:hAnsi="Arial" w:eastAsia="Arial" w:cs="Arial"/>
+                <w:rFonts w:ascii="Times New Roman" w:hAnsi="Helvetica" w:eastAsia="Helvetica" w:cs="Helvetica"/>
+                <w:i w:val="false"/>
+                <w:b w:val="false"/>
+                <w:u w:val="none"/>
+                <w:strike w:val="false"/>
+                <w:sz w:val="24"/>
+                <w:szCs w:val="24"/>
+                <w:color w:val="000000"/>
+              </w:rPr>
+            </w:pPr>
+            <w:r>
+              <w:rPr>
+                <w:rFonts w:ascii="Times New Roman" w:hAnsi="Helvetica" w:eastAsia="Helvetica" w:cs="Helvetica"/>
                 <w:i w:val="false"/>
                 <w:b w:val="false"/>
                 <w:u w:val="none"/>
@@ -1371,19 +1371,19 @@
               <w:spacing w:after="100" w:before="100" w:line="240"/>
               <w:ind w:left="100" w:right="100" w:firstLine="0" w:firstLineChars="0"/>
               <w:rPr>
-                <w:rFonts w:ascii="Times New Roman" w:hAnsi="Arial" w:eastAsia="Arial" w:cs="Arial"/>
-                <w:i w:val="false"/>
-                <w:b w:val="false"/>
-                <w:u w:val="none"/>
-                <w:strike w:val="false"/>
-                <w:sz w:val="24"/>
-                <w:szCs w:val="24"/>
-                <w:color w:val="000000"/>
-              </w:rPr>
-            </w:pPr>
-            <w:r>
-              <w:rPr>
-                <w:rFonts w:ascii="Times New Roman" w:hAnsi="Arial" w:eastAsia="Arial" w:cs="Arial"/>
+                <w:rFonts w:ascii="Times New Roman" w:hAnsi="Helvetica" w:eastAsia="Helvetica" w:cs="Helvetica"/>
+                <w:i w:val="false"/>
+                <w:b w:val="false"/>
+                <w:u w:val="none"/>
+                <w:strike w:val="false"/>
+                <w:sz w:val="24"/>
+                <w:szCs w:val="24"/>
+                <w:color w:val="000000"/>
+              </w:rPr>
+            </w:pPr>
+            <w:r>
+              <w:rPr>
+                <w:rFonts w:ascii="Times New Roman" w:hAnsi="Helvetica" w:eastAsia="Helvetica" w:cs="Helvetica"/>
                 <w:i w:val="false"/>
                 <w:b w:val="false"/>
                 <w:u w:val="none"/>
@@ -1426,19 +1426,19 @@
               <w:spacing w:after="100" w:before="100" w:line="240"/>
               <w:ind w:left="100" w:right="100" w:firstLine="0" w:firstLineChars="0"/>
               <w:rPr>
-                <w:rFonts w:ascii="Times New Roman" w:hAnsi="Arial" w:eastAsia="Arial" w:cs="Arial"/>
-                <w:i w:val="false"/>
-                <w:b w:val="false"/>
-                <w:u w:val="none"/>
-                <w:strike w:val="false"/>
-                <w:sz w:val="24"/>
-                <w:szCs w:val="24"/>
-                <w:color w:val="000000"/>
-              </w:rPr>
-            </w:pPr>
-            <w:r>
-              <w:rPr>
-                <w:rFonts w:ascii="Times New Roman" w:hAnsi="Arial" w:eastAsia="Arial" w:cs="Arial"/>
+                <w:rFonts w:ascii="Times New Roman" w:hAnsi="Helvetica" w:eastAsia="Helvetica" w:cs="Helvetica"/>
+                <w:i w:val="false"/>
+                <w:b w:val="false"/>
+                <w:u w:val="none"/>
+                <w:strike w:val="false"/>
+                <w:sz w:val="24"/>
+                <w:szCs w:val="24"/>
+                <w:color w:val="000000"/>
+              </w:rPr>
+            </w:pPr>
+            <w:r>
+              <w:rPr>
+                <w:rFonts w:ascii="Times New Roman" w:hAnsi="Helvetica" w:eastAsia="Helvetica" w:cs="Helvetica"/>
                 <w:i w:val="false"/>
                 <w:b w:val="false"/>
                 <w:u w:val="none"/>
@@ -1486,19 +1486,19 @@
               <w:spacing w:after="100" w:before="100" w:line="240"/>
               <w:ind w:left="100" w:right="100" w:firstLine="0" w:firstLineChars="0"/>
               <w:rPr>
-                <w:rFonts w:ascii="Times New Roman" w:hAnsi="Arial" w:eastAsia="Arial" w:cs="Arial"/>
-                <w:i w:val="false"/>
-                <w:b w:val="false"/>
-                <w:u w:val="none"/>
-                <w:strike w:val="false"/>
-                <w:sz w:val="24"/>
-                <w:szCs w:val="24"/>
-                <w:color w:val="000000"/>
-              </w:rPr>
-            </w:pPr>
-            <w:r>
-              <w:rPr>
-                <w:rFonts w:ascii="Times New Roman" w:hAnsi="Arial" w:eastAsia="Arial" w:cs="Arial"/>
+                <w:rFonts w:ascii="Times New Roman" w:hAnsi="Helvetica" w:eastAsia="Helvetica" w:cs="Helvetica"/>
+                <w:i w:val="false"/>
+                <w:b w:val="false"/>
+                <w:u w:val="none"/>
+                <w:strike w:val="false"/>
+                <w:sz w:val="24"/>
+                <w:szCs w:val="24"/>
+                <w:color w:val="000000"/>
+              </w:rPr>
+            </w:pPr>
+            <w:r>
+              <w:rPr>
+                <w:rFonts w:ascii="Times New Roman" w:hAnsi="Helvetica" w:eastAsia="Helvetica" w:cs="Helvetica"/>
                 <w:i w:val="false"/>
                 <w:b w:val="false"/>
                 <w:u w:val="none"/>
@@ -1541,19 +1541,19 @@
               <w:spacing w:after="100" w:before="100" w:line="240"/>
               <w:ind w:left="100" w:right="100" w:firstLine="0" w:firstLineChars="0"/>
               <w:rPr>
-                <w:rFonts w:ascii="Times New Roman" w:hAnsi="Arial" w:eastAsia="Arial" w:cs="Arial"/>
-                <w:i w:val="false"/>
-                <w:b w:val="false"/>
-                <w:u w:val="none"/>
-                <w:strike w:val="false"/>
-                <w:sz w:val="24"/>
-                <w:szCs w:val="24"/>
-                <w:color w:val="000000"/>
-              </w:rPr>
-            </w:pPr>
-            <w:r>
-              <w:rPr>
-                <w:rFonts w:ascii="Times New Roman" w:hAnsi="Arial" w:eastAsia="Arial" w:cs="Arial"/>
+                <w:rFonts w:ascii="Times New Roman" w:hAnsi="Helvetica" w:eastAsia="Helvetica" w:cs="Helvetica"/>
+                <w:i w:val="false"/>
+                <w:b w:val="false"/>
+                <w:u w:val="none"/>
+                <w:strike w:val="false"/>
+                <w:sz w:val="24"/>
+                <w:szCs w:val="24"/>
+                <w:color w:val="000000"/>
+              </w:rPr>
+            </w:pPr>
+            <w:r>
+              <w:rPr>
+                <w:rFonts w:ascii="Times New Roman" w:hAnsi="Helvetica" w:eastAsia="Helvetica" w:cs="Helvetica"/>
                 <w:i w:val="false"/>
                 <w:b w:val="false"/>
                 <w:u w:val="none"/>
@@ -1596,19 +1596,19 @@
               <w:spacing w:after="100" w:before="100" w:line="240"/>
               <w:ind w:left="100" w:right="100" w:firstLine="0" w:firstLineChars="0"/>
               <w:rPr>
-                <w:rFonts w:ascii="Times New Roman" w:hAnsi="Arial" w:eastAsia="Arial" w:cs="Arial"/>
-                <w:i w:val="false"/>
-                <w:b w:val="false"/>
-                <w:u w:val="none"/>
-                <w:strike w:val="false"/>
-                <w:sz w:val="24"/>
-                <w:szCs w:val="24"/>
-                <w:color w:val="000000"/>
-              </w:rPr>
-            </w:pPr>
-            <w:r>
-              <w:rPr>
-                <w:rFonts w:ascii="Times New Roman" w:hAnsi="Arial" w:eastAsia="Arial" w:cs="Arial"/>
+                <w:rFonts w:ascii="Times New Roman" w:hAnsi="Helvetica" w:eastAsia="Helvetica" w:cs="Helvetica"/>
+                <w:i w:val="false"/>
+                <w:b w:val="false"/>
+                <w:u w:val="none"/>
+                <w:strike w:val="false"/>
+                <w:sz w:val="24"/>
+                <w:szCs w:val="24"/>
+                <w:color w:val="000000"/>
+              </w:rPr>
+            </w:pPr>
+            <w:r>
+              <w:rPr>
+                <w:rFonts w:ascii="Times New Roman" w:hAnsi="Helvetica" w:eastAsia="Helvetica" w:cs="Helvetica"/>
                 <w:i w:val="false"/>
                 <w:b w:val="false"/>
                 <w:u w:val="none"/>
@@ -1651,19 +1651,19 @@
               <w:spacing w:after="100" w:before="100" w:line="240"/>
               <w:ind w:left="100" w:right="100" w:firstLine="0" w:firstLineChars="0"/>
               <w:rPr>
-                <w:rFonts w:ascii="Times New Roman" w:hAnsi="Arial" w:eastAsia="Arial" w:cs="Arial"/>
-                <w:i w:val="false"/>
-                <w:b w:val="false"/>
-                <w:u w:val="none"/>
-                <w:strike w:val="false"/>
-                <w:sz w:val="24"/>
-                <w:szCs w:val="24"/>
-                <w:color w:val="000000"/>
-              </w:rPr>
-            </w:pPr>
-            <w:r>
-              <w:rPr>
-                <w:rFonts w:ascii="Times New Roman" w:hAnsi="Arial" w:eastAsia="Arial" w:cs="Arial"/>
+                <w:rFonts w:ascii="Times New Roman" w:hAnsi="Helvetica" w:eastAsia="Helvetica" w:cs="Helvetica"/>
+                <w:i w:val="false"/>
+                <w:b w:val="false"/>
+                <w:u w:val="none"/>
+                <w:strike w:val="false"/>
+                <w:sz w:val="24"/>
+                <w:szCs w:val="24"/>
+                <w:color w:val="000000"/>
+              </w:rPr>
+            </w:pPr>
+            <w:r>
+              <w:rPr>
+                <w:rFonts w:ascii="Times New Roman" w:hAnsi="Helvetica" w:eastAsia="Helvetica" w:cs="Helvetica"/>
                 <w:i w:val="false"/>
                 <w:b w:val="false"/>
                 <w:u w:val="none"/>
@@ -1711,19 +1711,19 @@
               <w:spacing w:after="100" w:before="100" w:line="240"/>
               <w:ind w:left="100" w:right="100" w:firstLine="0" w:firstLineChars="0"/>
               <w:rPr>
-                <w:rFonts w:ascii="Times New Roman" w:hAnsi="Arial" w:eastAsia="Arial" w:cs="Arial"/>
-                <w:i w:val="false"/>
-                <w:b w:val="false"/>
-                <w:u w:val="none"/>
-                <w:strike w:val="false"/>
-                <w:sz w:val="24"/>
-                <w:szCs w:val="24"/>
-                <w:color w:val="000000"/>
-              </w:rPr>
-            </w:pPr>
-            <w:r>
-              <w:rPr>
-                <w:rFonts w:ascii="Times New Roman" w:hAnsi="Arial" w:eastAsia="Arial" w:cs="Arial"/>
+                <w:rFonts w:ascii="Times New Roman" w:hAnsi="Helvetica" w:eastAsia="Helvetica" w:cs="Helvetica"/>
+                <w:i w:val="false"/>
+                <w:b w:val="false"/>
+                <w:u w:val="none"/>
+                <w:strike w:val="false"/>
+                <w:sz w:val="24"/>
+                <w:szCs w:val="24"/>
+                <w:color w:val="000000"/>
+              </w:rPr>
+            </w:pPr>
+            <w:r>
+              <w:rPr>
+                <w:rFonts w:ascii="Times New Roman" w:hAnsi="Helvetica" w:eastAsia="Helvetica" w:cs="Helvetica"/>
                 <w:i w:val="false"/>
                 <w:b w:val="false"/>
                 <w:u w:val="none"/>
@@ -1736,7 +1736,7 @@
             </w:r>
             <w:r>
               <w:rPr>
-                <w:rFonts w:ascii="Times New Roman" w:hAnsi="Arial" w:eastAsia="Arial" w:cs="Arial"/>
+                <w:rFonts w:ascii="Times New Roman" w:hAnsi="Helvetica" w:eastAsia="Helvetica" w:cs="Helvetica"/>
                 <w:i w:val="false"/>
                 <w:b w:val="false"/>
                 <w:u w:val="none"/>
@@ -1780,19 +1780,19 @@
               <w:spacing w:after="100" w:before="100" w:line="240"/>
               <w:ind w:left="100" w:right="100" w:firstLine="0" w:firstLineChars="0"/>
               <w:rPr>
-                <w:rFonts w:ascii="Times New Roman" w:hAnsi="Arial" w:eastAsia="Arial" w:cs="Arial"/>
-                <w:i w:val="false"/>
-                <w:b w:val="false"/>
-                <w:u w:val="none"/>
-                <w:strike w:val="false"/>
-                <w:sz w:val="24"/>
-                <w:szCs w:val="24"/>
-                <w:color w:val="000000"/>
-              </w:rPr>
-            </w:pPr>
-            <w:r>
-              <w:rPr>
-                <w:rFonts w:ascii="Times New Roman" w:hAnsi="Arial" w:eastAsia="Arial" w:cs="Arial"/>
+                <w:rFonts w:ascii="Times New Roman" w:hAnsi="Helvetica" w:eastAsia="Helvetica" w:cs="Helvetica"/>
+                <w:i w:val="false"/>
+                <w:b w:val="false"/>
+                <w:u w:val="none"/>
+                <w:strike w:val="false"/>
+                <w:sz w:val="24"/>
+                <w:szCs w:val="24"/>
+                <w:color w:val="000000"/>
+              </w:rPr>
+            </w:pPr>
+            <w:r>
+              <w:rPr>
+                <w:rFonts w:ascii="Times New Roman" w:hAnsi="Helvetica" w:eastAsia="Helvetica" w:cs="Helvetica"/>
                 <w:i w:val="false"/>
                 <w:b w:val="false"/>
                 <w:u w:val="none"/>
@@ -1835,19 +1835,19 @@
               <w:spacing w:after="100" w:before="100" w:line="240"/>
               <w:ind w:left="100" w:right="100" w:firstLine="0" w:firstLineChars="0"/>
               <w:rPr>
-                <w:rFonts w:ascii="Times New Roman" w:hAnsi="Arial" w:eastAsia="Arial" w:cs="Arial"/>
-                <w:i w:val="false"/>
-                <w:b w:val="false"/>
-                <w:u w:val="none"/>
-                <w:strike w:val="false"/>
-                <w:sz w:val="24"/>
-                <w:szCs w:val="24"/>
-                <w:color w:val="000000"/>
-              </w:rPr>
-            </w:pPr>
-            <w:r>
-              <w:rPr>
-                <w:rFonts w:ascii="Times New Roman" w:hAnsi="Arial" w:eastAsia="Arial" w:cs="Arial"/>
+                <w:rFonts w:ascii="Times New Roman" w:hAnsi="Helvetica" w:eastAsia="Helvetica" w:cs="Helvetica"/>
+                <w:i w:val="false"/>
+                <w:b w:val="false"/>
+                <w:u w:val="none"/>
+                <w:strike w:val="false"/>
+                <w:sz w:val="24"/>
+                <w:szCs w:val="24"/>
+                <w:color w:val="000000"/>
+              </w:rPr>
+            </w:pPr>
+            <w:r>
+              <w:rPr>
+                <w:rFonts w:ascii="Times New Roman" w:hAnsi="Helvetica" w:eastAsia="Helvetica" w:cs="Helvetica"/>
                 <w:i w:val="false"/>
                 <w:b w:val="false"/>
                 <w:u w:val="none"/>
@@ -1890,19 +1890,19 @@
               <w:spacing w:after="100" w:before="100" w:line="240"/>
               <w:ind w:left="100" w:right="100" w:firstLine="0" w:firstLineChars="0"/>
               <w:rPr>
-                <w:rFonts w:ascii="Times New Roman" w:hAnsi="Arial" w:eastAsia="Arial" w:cs="Arial"/>
-                <w:i w:val="false"/>
-                <w:b w:val="false"/>
-                <w:u w:val="none"/>
-                <w:strike w:val="false"/>
-                <w:sz w:val="24"/>
-                <w:szCs w:val="24"/>
-                <w:color w:val="000000"/>
-              </w:rPr>
-            </w:pPr>
-            <w:r>
-              <w:rPr>
-                <w:rFonts w:ascii="Times New Roman" w:hAnsi="Arial" w:eastAsia="Arial" w:cs="Arial"/>
+                <w:rFonts w:ascii="Times New Roman" w:hAnsi="Helvetica" w:eastAsia="Helvetica" w:cs="Helvetica"/>
+                <w:i w:val="false"/>
+                <w:b w:val="false"/>
+                <w:u w:val="none"/>
+                <w:strike w:val="false"/>
+                <w:sz w:val="24"/>
+                <w:szCs w:val="24"/>
+                <w:color w:val="000000"/>
+              </w:rPr>
+            </w:pPr>
+            <w:r>
+              <w:rPr>
+                <w:rFonts w:ascii="Times New Roman" w:hAnsi="Helvetica" w:eastAsia="Helvetica" w:cs="Helvetica"/>
                 <w:i w:val="false"/>
                 <w:b w:val="false"/>
                 <w:u w:val="none"/>
@@ -1951,7 +1951,7 @@
               <w:spacing w:after="100" w:before="100" w:line="240"/>
               <w:ind w:left="100" w:right="100" w:firstLine="0" w:firstLineChars="0"/>
               <w:rPr>
-                <w:rFonts w:ascii="Times New Roman" w:hAnsi="Arial" w:eastAsia="Arial" w:cs="Arial"/>
+                <w:rFonts w:ascii="Times New Roman" w:hAnsi="Helvetica" w:eastAsia="Helvetica" w:cs="Helvetica"/>
                 <w:i w:val="false"/>
                 <w:b w:val="true"/>
                 <w:u w:val="none"/>
@@ -1963,7 +1963,7 @@
             </w:pPr>
             <w:r>
               <w:rPr>
-                <w:rFonts w:ascii="Times New Roman" w:hAnsi="Arial" w:eastAsia="Arial" w:cs="Arial"/>
+                <w:rFonts w:ascii="Times New Roman" w:hAnsi="Helvetica" w:eastAsia="Helvetica" w:cs="Helvetica"/>
                 <w:i w:val="false"/>
                 <w:b w:val="true"/>
                 <w:u w:val="none"/>
@@ -2011,19 +2011,19 @@
               <w:spacing w:after="100" w:before="100" w:line="240"/>
               <w:ind w:left="100" w:right="100" w:firstLine="0" w:firstLineChars="0"/>
               <w:rPr>
-                <w:rFonts w:ascii="Times New Roman" w:hAnsi="Arial" w:eastAsia="Arial" w:cs="Arial"/>
-                <w:i w:val="false"/>
-                <w:b w:val="false"/>
-                <w:u w:val="none"/>
-                <w:strike w:val="false"/>
-                <w:sz w:val="24"/>
-                <w:szCs w:val="24"/>
-                <w:color w:val="000000"/>
-              </w:rPr>
-            </w:pPr>
-            <w:r>
-              <w:rPr>
-                <w:rFonts w:ascii="Times New Roman" w:hAnsi="Arial" w:eastAsia="Arial" w:cs="Arial"/>
+                <w:rFonts w:ascii="Times New Roman" w:hAnsi="Helvetica" w:eastAsia="Helvetica" w:cs="Helvetica"/>
+                <w:i w:val="false"/>
+                <w:b w:val="false"/>
+                <w:u w:val="none"/>
+                <w:strike w:val="false"/>
+                <w:sz w:val="24"/>
+                <w:szCs w:val="24"/>
+                <w:color w:val="000000"/>
+              </w:rPr>
+            </w:pPr>
+            <w:r>
+              <w:rPr>
+                <w:rFonts w:ascii="Times New Roman" w:hAnsi="Helvetica" w:eastAsia="Helvetica" w:cs="Helvetica"/>
                 <w:i w:val="false"/>
                 <w:b w:val="false"/>
                 <w:u w:val="none"/>
@@ -2066,19 +2066,19 @@
               <w:spacing w:after="100" w:before="100" w:line="240"/>
               <w:ind w:left="100" w:right="100" w:firstLine="0" w:firstLineChars="0"/>
               <w:rPr>
-                <w:rFonts w:ascii="Times New Roman" w:hAnsi="Arial" w:eastAsia="Arial" w:cs="Arial"/>
-                <w:i w:val="false"/>
-                <w:b w:val="false"/>
-                <w:u w:val="none"/>
-                <w:strike w:val="false"/>
-                <w:sz w:val="24"/>
-                <w:szCs w:val="24"/>
-                <w:color w:val="000000"/>
-              </w:rPr>
-            </w:pPr>
-            <w:r>
-              <w:rPr>
-                <w:rFonts w:ascii="Times New Roman" w:hAnsi="Arial" w:eastAsia="Arial" w:cs="Arial"/>
+                <w:rFonts w:ascii="Times New Roman" w:hAnsi="Helvetica" w:eastAsia="Helvetica" w:cs="Helvetica"/>
+                <w:i w:val="false"/>
+                <w:b w:val="false"/>
+                <w:u w:val="none"/>
+                <w:strike w:val="false"/>
+                <w:sz w:val="24"/>
+                <w:szCs w:val="24"/>
+                <w:color w:val="000000"/>
+              </w:rPr>
+            </w:pPr>
+            <w:r>
+              <w:rPr>
+                <w:rFonts w:ascii="Times New Roman" w:hAnsi="Helvetica" w:eastAsia="Helvetica" w:cs="Helvetica"/>
                 <w:i w:val="false"/>
                 <w:b w:val="false"/>
                 <w:u w:val="none"/>
@@ -2121,19 +2121,19 @@
               <w:spacing w:after="100" w:before="100" w:line="240"/>
               <w:ind w:left="100" w:right="100" w:firstLine="0" w:firstLineChars="0"/>
               <w:rPr>
-                <w:rFonts w:ascii="Times New Roman" w:hAnsi="Arial" w:eastAsia="Arial" w:cs="Arial"/>
-                <w:i w:val="false"/>
-                <w:b w:val="false"/>
-                <w:u w:val="none"/>
-                <w:strike w:val="false"/>
-                <w:sz w:val="24"/>
-                <w:szCs w:val="24"/>
-                <w:color w:val="000000"/>
-              </w:rPr>
-            </w:pPr>
-            <w:r>
-              <w:rPr>
-                <w:rFonts w:ascii="Times New Roman" w:hAnsi="Arial" w:eastAsia="Arial" w:cs="Arial"/>
+                <w:rFonts w:ascii="Times New Roman" w:hAnsi="Helvetica" w:eastAsia="Helvetica" w:cs="Helvetica"/>
+                <w:i w:val="false"/>
+                <w:b w:val="false"/>
+                <w:u w:val="none"/>
+                <w:strike w:val="false"/>
+                <w:sz w:val="24"/>
+                <w:szCs w:val="24"/>
+                <w:color w:val="000000"/>
+              </w:rPr>
+            </w:pPr>
+            <w:r>
+              <w:rPr>
+                <w:rFonts w:ascii="Times New Roman" w:hAnsi="Helvetica" w:eastAsia="Helvetica" w:cs="Helvetica"/>
                 <w:i w:val="false"/>
                 <w:b w:val="false"/>
                 <w:u w:val="none"/>
@@ -2176,19 +2176,19 @@
               <w:spacing w:after="100" w:before="100" w:line="240"/>
               <w:ind w:left="100" w:right="100" w:firstLine="0" w:firstLineChars="0"/>
               <w:rPr>
-                <w:rFonts w:ascii="Times New Roman" w:hAnsi="Arial" w:eastAsia="Arial" w:cs="Arial"/>
-                <w:i w:val="false"/>
-                <w:b w:val="false"/>
-                <w:u w:val="none"/>
-                <w:strike w:val="false"/>
-                <w:sz w:val="24"/>
-                <w:szCs w:val="24"/>
-                <w:color w:val="000000"/>
-              </w:rPr>
-            </w:pPr>
-            <w:r>
-              <w:rPr>
-                <w:rFonts w:ascii="Times New Roman" w:hAnsi="Arial" w:eastAsia="Arial" w:cs="Arial"/>
+                <w:rFonts w:ascii="Times New Roman" w:hAnsi="Helvetica" w:eastAsia="Helvetica" w:cs="Helvetica"/>
+                <w:i w:val="false"/>
+                <w:b w:val="false"/>
+                <w:u w:val="none"/>
+                <w:strike w:val="false"/>
+                <w:sz w:val="24"/>
+                <w:szCs w:val="24"/>
+                <w:color w:val="000000"/>
+              </w:rPr>
+            </w:pPr>
+            <w:r>
+              <w:rPr>
+                <w:rFonts w:ascii="Times New Roman" w:hAnsi="Helvetica" w:eastAsia="Helvetica" w:cs="Helvetica"/>
                 <w:i w:val="false"/>
                 <w:b w:val="false"/>
                 <w:u w:val="none"/>
@@ -2236,19 +2236,19 @@
               <w:spacing w:after="100" w:before="100" w:line="240"/>
               <w:ind w:left="100" w:right="100" w:firstLine="0" w:firstLineChars="0"/>
               <w:rPr>
-                <w:rFonts w:ascii="Times New Roman" w:hAnsi="Arial" w:eastAsia="Arial" w:cs="Arial"/>
-                <w:i w:val="false"/>
-                <w:b w:val="false"/>
-                <w:u w:val="none"/>
-                <w:strike w:val="false"/>
-                <w:sz w:val="24"/>
-                <w:szCs w:val="24"/>
-                <w:color w:val="000000"/>
-              </w:rPr>
-            </w:pPr>
-            <w:r>
-              <w:rPr>
-                <w:rFonts w:ascii="Times New Roman" w:hAnsi="Arial" w:eastAsia="Arial" w:cs="Arial"/>
+                <w:rFonts w:ascii="Times New Roman" w:hAnsi="Helvetica" w:eastAsia="Helvetica" w:cs="Helvetica"/>
+                <w:i w:val="false"/>
+                <w:b w:val="false"/>
+                <w:u w:val="none"/>
+                <w:strike w:val="false"/>
+                <w:sz w:val="24"/>
+                <w:szCs w:val="24"/>
+                <w:color w:val="000000"/>
+              </w:rPr>
+            </w:pPr>
+            <w:r>
+              <w:rPr>
+                <w:rFonts w:ascii="Times New Roman" w:hAnsi="Helvetica" w:eastAsia="Helvetica" w:cs="Helvetica"/>
                 <w:i w:val="false"/>
                 <w:b w:val="false"/>
                 <w:u w:val="none"/>
@@ -2291,19 +2291,19 @@
               <w:spacing w:after="100" w:before="100" w:line="240"/>
               <w:ind w:left="100" w:right="100" w:firstLine="0" w:firstLineChars="0"/>
               <w:rPr>
-                <w:rFonts w:ascii="Times New Roman" w:hAnsi="Arial" w:eastAsia="Arial" w:cs="Arial"/>
-                <w:i w:val="false"/>
-                <w:b w:val="false"/>
-                <w:u w:val="none"/>
-                <w:strike w:val="false"/>
-                <w:sz w:val="24"/>
-                <w:szCs w:val="24"/>
-                <w:color w:val="000000"/>
-              </w:rPr>
-            </w:pPr>
-            <w:r>
-              <w:rPr>
-                <w:rFonts w:ascii="Times New Roman" w:hAnsi="Arial" w:eastAsia="Arial" w:cs="Arial"/>
+                <w:rFonts w:ascii="Times New Roman" w:hAnsi="Helvetica" w:eastAsia="Helvetica" w:cs="Helvetica"/>
+                <w:i w:val="false"/>
+                <w:b w:val="false"/>
+                <w:u w:val="none"/>
+                <w:strike w:val="false"/>
+                <w:sz w:val="24"/>
+                <w:szCs w:val="24"/>
+                <w:color w:val="000000"/>
+              </w:rPr>
+            </w:pPr>
+            <w:r>
+              <w:rPr>
+                <w:rFonts w:ascii="Times New Roman" w:hAnsi="Helvetica" w:eastAsia="Helvetica" w:cs="Helvetica"/>
                 <w:i w:val="false"/>
                 <w:b w:val="false"/>
                 <w:u w:val="none"/>
@@ -2346,19 +2346,19 @@
               <w:spacing w:after="100" w:before="100" w:line="240"/>
               <w:ind w:left="100" w:right="100" w:firstLine="0" w:firstLineChars="0"/>
               <w:rPr>
-                <w:rFonts w:ascii="Times New Roman" w:hAnsi="Arial" w:eastAsia="Arial" w:cs="Arial"/>
-                <w:i w:val="false"/>
-                <w:b w:val="false"/>
-                <w:u w:val="none"/>
-                <w:strike w:val="false"/>
-                <w:sz w:val="24"/>
-                <w:szCs w:val="24"/>
-                <w:color w:val="000000"/>
-              </w:rPr>
-            </w:pPr>
-            <w:r>
-              <w:rPr>
-                <w:rFonts w:ascii="Times New Roman" w:hAnsi="Arial" w:eastAsia="Arial" w:cs="Arial"/>
+                <w:rFonts w:ascii="Times New Roman" w:hAnsi="Helvetica" w:eastAsia="Helvetica" w:cs="Helvetica"/>
+                <w:i w:val="false"/>
+                <w:b w:val="false"/>
+                <w:u w:val="none"/>
+                <w:strike w:val="false"/>
+                <w:sz w:val="24"/>
+                <w:szCs w:val="24"/>
+                <w:color w:val="000000"/>
+              </w:rPr>
+            </w:pPr>
+            <w:r>
+              <w:rPr>
+                <w:rFonts w:ascii="Times New Roman" w:hAnsi="Helvetica" w:eastAsia="Helvetica" w:cs="Helvetica"/>
                 <w:i w:val="false"/>
                 <w:b w:val="false"/>
                 <w:u w:val="none"/>
@@ -2401,19 +2401,19 @@
               <w:spacing w:after="100" w:before="100" w:line="240"/>
               <w:ind w:left="100" w:right="100" w:firstLine="0" w:firstLineChars="0"/>
               <w:rPr>
-                <w:rFonts w:ascii="Times New Roman" w:hAnsi="Arial" w:eastAsia="Arial" w:cs="Arial"/>
-                <w:i w:val="false"/>
-                <w:b w:val="false"/>
-                <w:u w:val="none"/>
-                <w:strike w:val="false"/>
-                <w:sz w:val="24"/>
-                <w:szCs w:val="24"/>
-                <w:color w:val="000000"/>
-              </w:rPr>
-            </w:pPr>
-            <w:r>
-              <w:rPr>
-                <w:rFonts w:ascii="Times New Roman" w:hAnsi="Arial" w:eastAsia="Arial" w:cs="Arial"/>
+                <w:rFonts w:ascii="Times New Roman" w:hAnsi="Helvetica" w:eastAsia="Helvetica" w:cs="Helvetica"/>
+                <w:i w:val="false"/>
+                <w:b w:val="false"/>
+                <w:u w:val="none"/>
+                <w:strike w:val="false"/>
+                <w:sz w:val="24"/>
+                <w:szCs w:val="24"/>
+                <w:color w:val="000000"/>
+              </w:rPr>
+            </w:pPr>
+            <w:r>
+              <w:rPr>
+                <w:rFonts w:ascii="Times New Roman" w:hAnsi="Helvetica" w:eastAsia="Helvetica" w:cs="Helvetica"/>
                 <w:i w:val="false"/>
                 <w:b w:val="false"/>
                 <w:u w:val="none"/>
@@ -2462,19 +2462,19 @@
               <w:spacing w:after="100" w:before="100" w:line="240"/>
               <w:ind w:left="100" w:right="100" w:firstLine="0" w:firstLineChars="0"/>
               <w:rPr>
-                <w:rFonts w:ascii="Times New Roman" w:hAnsi="Arial" w:eastAsia="Arial" w:cs="Arial"/>
-                <w:i w:val="false"/>
-                <w:b w:val="false"/>
-                <w:u w:val="none"/>
-                <w:strike w:val="false"/>
-                <w:sz w:val="24"/>
-                <w:szCs w:val="24"/>
-                <w:color w:val="000000"/>
-              </w:rPr>
-            </w:pPr>
-            <w:r>
-              <w:rPr>
-                <w:rFonts w:ascii="Times New Roman" w:hAnsi="Arial" w:eastAsia="Arial" w:cs="Arial"/>
+                <w:rFonts w:ascii="Times New Roman" w:hAnsi="Helvetica" w:eastAsia="Helvetica" w:cs="Helvetica"/>
+                <w:i w:val="false"/>
+                <w:b w:val="false"/>
+                <w:u w:val="none"/>
+                <w:strike w:val="false"/>
+                <w:sz w:val="24"/>
+                <w:szCs w:val="24"/>
+                <w:color w:val="000000"/>
+              </w:rPr>
+            </w:pPr>
+            <w:r>
+              <w:rPr>
+                <w:rFonts w:ascii="Times New Roman" w:hAnsi="Helvetica" w:eastAsia="Helvetica" w:cs="Helvetica"/>
                 <w:i w:val="false"/>
                 <w:b w:val="false"/>
                 <w:u w:val="none"/>
@@ -2488,7 +2488,7 @@
             </w:r>
             <w:r>
               <w:rPr>
-                <w:rFonts w:ascii="Times New Roman" w:hAnsi="Arial" w:eastAsia="Arial" w:cs="Arial"/>
+                <w:rFonts w:ascii="Times New Roman" w:hAnsi="Helvetica" w:eastAsia="Helvetica" w:cs="Helvetica"/>
                 <w:i w:val="false"/>
                 <w:b w:val="false"/>
                 <w:u w:val="none"/>

</xml_diff>